<commit_message>
Add digital studio to recruiter profile
</commit_message>
<xml_diff>
--- a/private/expertise/Lebenslauf_Marcel_Spahr_2026.docx
+++ b/private/expertise/Lebenslauf_Marcel_Spahr_2026.docx
@@ -6,7 +6,7 @@
     <w:p>
       <w:pPr>
         <w:pStyle w:val="berschrift1"/>
-        <w:divId w:val="1100760480"/>
+        <w:divId w:val="1738547201"/>
         <w:rPr>
           <w:rFonts w:ascii="Calibri" w:eastAsia="Times New Roman" w:hAnsi="Calibri"/>
           <w:lang w:val="de-DE"/>
@@ -22,7 +22,7 @@
     </w:p>
     <w:p>
       <w:pPr>
-        <w:divId w:val="409624702"/>
+        <w:divId w:val="1745880460"/>
         <w:rPr>
           <w:rFonts w:ascii="Calibri" w:eastAsia="Times New Roman" w:hAnsi="Calibri"/>
           <w:b/>
@@ -50,7 +50,7 @@
     </w:p>
     <w:p>
       <w:pPr>
-        <w:divId w:val="1893223657"/>
+        <w:divId w:val="1584297928"/>
         <w:rPr>
           <w:rFonts w:ascii="Calibri" w:eastAsia="Times New Roman" w:hAnsi="Calibri"/>
           <w:color w:val="52677D"/>
@@ -72,7 +72,7 @@
     </w:p>
     <w:p>
       <w:pPr>
-        <w:divId w:val="594048747"/>
+        <w:divId w:val="1387727221"/>
         <w:rPr>
           <w:rFonts w:ascii="Calibri" w:eastAsia="Times New Roman" w:hAnsi="Calibri"/>
           <w:color w:val="334B62"/>
@@ -250,7 +250,7 @@
           <w:lang w:val="de-DE"/>
         </w:rPr>
         <w:drawing>
-          <wp:inline distT="0" distB="0" distL="0" distR="0" wp14:anchorId="0CCCC474" wp14:editId="2699401A">
+          <wp:inline distT="0" distB="0" distL="0" distR="0" wp14:anchorId="4F54C9C4" wp14:editId="02CD4F21">
             <wp:extent cx="1157605" cy="1157605"/>
             <wp:effectExtent l="0" t="0" r="0" b="0"/>
             <wp:docPr id="1" name="Bild 1" descr="Marcel Spahr"/>
@@ -349,20 +349,20 @@
           <w:rFonts w:ascii="Calibri" w:hAnsi="Calibri"/>
           <w:lang w:val="de-DE"/>
         </w:rPr>
-        <w:t>Wirtschaftsinformatiker HF in Abschlussphase mit über 16 Jahren Berufspraxis bei Swisscom. Ich verbinde Fachbereiche, Nutzerbedürfnisse und technische Umsetzung: von der strukturierten Erhebung und Priorisierung von Anforderungen über Prozessanalyse und Testing bis zur Einführung alltagstauglicher Lösungen. Meine Stärke ist die Kombinatio</w:t>
+        <w:t>Wirtschaftsinformatiker HF in Abschlussphase mit über 16 Jahren Berufspraxis bei Swisscom und studienbegleitender Selbständigkeit im eigenen Digitalstudio. Ich verbinde Fachbereiche, Nutzerbedürfnisse und technische Umsetzung: von der strukturier</w:t>
       </w:r>
       <w:r>
         <w:rPr>
           <w:rFonts w:ascii="Calibri" w:hAnsi="Calibri"/>
           <w:lang w:val="de-DE"/>
         </w:rPr>
-        <w:t>n aus analytischem Denken, Empathie, technischer Umsetzungskompetenz und klarer Kommunikation zwischen Business und IT.</w:t>
+        <w:t>ten Erhebung und Priorisierung von Anforderungen über Prozessanalyse und Testing bis zur Einführung alltagstauglicher Lösungen. Meine Stärke ist die Kombination aus analytischem Denken, Empathie, technischer Umsetzungskompetenz und klarer Kommunikation zwischen Business und IT.</w:t>
       </w:r>
     </w:p>
     <w:p>
       <w:pPr>
         <w:shd w:val="clear" w:color="auto" w:fill="F3F7FB"/>
-        <w:divId w:val="938759813"/>
+        <w:divId w:val="1533111257"/>
         <w:rPr>
           <w:rFonts w:ascii="Calibri" w:eastAsia="Times New Roman" w:hAnsi="Calibri"/>
           <w:color w:val="1D3248"/>
@@ -397,7 +397,7 @@
     <w:p>
       <w:pPr>
         <w:shd w:val="clear" w:color="auto" w:fill="F3F7FB"/>
-        <w:divId w:val="1088773830"/>
+        <w:divId w:val="210315155"/>
         <w:rPr>
           <w:rFonts w:ascii="Calibri" w:eastAsia="Times New Roman" w:hAnsi="Calibri"/>
           <w:color w:val="1D3248"/>
@@ -432,7 +432,7 @@
     <w:p>
       <w:pPr>
         <w:shd w:val="clear" w:color="auto" w:fill="F3F7FB"/>
-        <w:divId w:val="2110618386"/>
+        <w:divId w:val="1171142378"/>
         <w:rPr>
           <w:rFonts w:ascii="Calibri" w:eastAsia="Times New Roman" w:hAnsi="Calibri"/>
           <w:color w:val="1D3248"/>
@@ -467,7 +467,7 @@
     <w:p>
       <w:pPr>
         <w:shd w:val="clear" w:color="auto" w:fill="F3F7FB"/>
-        <w:divId w:val="288979699"/>
+        <w:divId w:val="1407142142"/>
         <w:rPr>
           <w:rFonts w:ascii="Calibri" w:eastAsia="Times New Roman" w:hAnsi="Calibri"/>
           <w:color w:val="1D3248"/>
@@ -529,7 +529,7 @@
     <w:p>
       <w:pPr>
         <w:outlineLvl w:val="3"/>
-        <w:divId w:val="559636371"/>
+        <w:divId w:val="1515925813"/>
         <w:rPr>
           <w:rFonts w:ascii="Calibri" w:eastAsia="Times New Roman" w:hAnsi="Calibri"/>
           <w:b/>
@@ -556,7 +556,7 @@
     <w:p>
       <w:pPr>
         <w:spacing w:before="85"/>
-        <w:divId w:val="559636371"/>
+        <w:divId w:val="1515925813"/>
         <w:rPr>
           <w:rFonts w:ascii="Calibri" w:hAnsi="Calibri"/>
           <w:color w:val="52677D"/>
@@ -579,7 +579,7 @@
     <w:p>
       <w:pPr>
         <w:outlineLvl w:val="3"/>
-        <w:divId w:val="955284302"/>
+        <w:divId w:val="1727610371"/>
         <w:rPr>
           <w:rFonts w:ascii="Calibri" w:eastAsia="Times New Roman" w:hAnsi="Calibri"/>
           <w:b/>
@@ -606,7 +606,7 @@
     <w:p>
       <w:pPr>
         <w:spacing w:before="85"/>
-        <w:divId w:val="955284302"/>
+        <w:divId w:val="1727610371"/>
         <w:rPr>
           <w:rFonts w:ascii="Calibri" w:hAnsi="Calibri"/>
           <w:color w:val="52677D"/>
@@ -629,7 +629,7 @@
     <w:p>
       <w:pPr>
         <w:outlineLvl w:val="3"/>
-        <w:divId w:val="279337285"/>
+        <w:divId w:val="594166718"/>
         <w:rPr>
           <w:rFonts w:ascii="Calibri" w:eastAsia="Times New Roman" w:hAnsi="Calibri"/>
           <w:b/>
@@ -656,7 +656,7 @@
     <w:p>
       <w:pPr>
         <w:spacing w:before="85"/>
-        <w:divId w:val="279337285"/>
+        <w:divId w:val="594166718"/>
         <w:rPr>
           <w:rFonts w:ascii="Calibri" w:hAnsi="Calibri"/>
           <w:color w:val="52677D"/>
@@ -706,57 +706,57 @@
     <w:p>
       <w:pPr>
         <w:pStyle w:val="berschrift3"/>
-        <w:divId w:val="1543244769"/>
-        <w:rPr>
-          <w:rFonts w:ascii="Calibri" w:eastAsia="Times New Roman" w:hAnsi="Calibri"/>
-          <w:color w:val="1D3248"/>
-          <w:lang w:val="de-DE"/>
-        </w:rPr>
-      </w:pPr>
-      <w:r>
-        <w:rPr>
-          <w:rFonts w:ascii="Calibri" w:eastAsia="Times New Roman" w:hAnsi="Calibri"/>
-          <w:color w:val="1D3248"/>
-          <w:lang w:val="de-DE"/>
-        </w:rPr>
-        <w:t>Customer Consultant, Bereich Specials</w:t>
-      </w:r>
-    </w:p>
-    <w:p>
-      <w:pPr>
-        <w:divId w:val="1543244769"/>
-        <w:rPr>
-          <w:rFonts w:ascii="Calibri" w:eastAsia="Times New Roman" w:hAnsi="Calibri"/>
-          <w:color w:val="1D3248"/>
-          <w:sz w:val="18"/>
-          <w:szCs w:val="18"/>
-          <w:lang w:val="de-DE"/>
-        </w:rPr>
-      </w:pPr>
-      <w:r>
-        <w:rPr>
-          <w:rFonts w:ascii="Calibri" w:eastAsia="Times New Roman" w:hAnsi="Calibri"/>
-          <w:color w:val="1D3248"/>
-          <w:sz w:val="18"/>
-          <w:szCs w:val="18"/>
-          <w:lang w:val="de-DE"/>
-        </w:rPr>
-        <w:t>08/2016 – 04/202</w:t>
-      </w:r>
-      <w:r>
-        <w:rPr>
-          <w:rFonts w:ascii="Calibri" w:eastAsia="Times New Roman" w:hAnsi="Calibri"/>
-          <w:color w:val="1D3248"/>
-          <w:sz w:val="18"/>
-          <w:szCs w:val="18"/>
-          <w:lang w:val="de-DE"/>
-        </w:rPr>
-        <w:t>5</w:t>
-      </w:r>
-    </w:p>
-    <w:p>
-      <w:pPr>
-        <w:divId w:val="1269460872"/>
+        <w:divId w:val="1716925754"/>
+        <w:rPr>
+          <w:rFonts w:ascii="Calibri" w:eastAsia="Times New Roman" w:hAnsi="Calibri"/>
+          <w:color w:val="1D3248"/>
+          <w:lang w:val="de-DE"/>
+        </w:rPr>
+      </w:pPr>
+      <w:r>
+        <w:rPr>
+          <w:rFonts w:ascii="Calibri" w:eastAsia="Times New Roman" w:hAnsi="Calibri"/>
+          <w:color w:val="1D3248"/>
+          <w:lang w:val="de-DE"/>
+        </w:rPr>
+        <w:t>Selbständig · Digitalstudio Marcel Spahr</w:t>
+      </w:r>
+    </w:p>
+    <w:p>
+      <w:pPr>
+        <w:divId w:val="1716925754"/>
+        <w:rPr>
+          <w:rFonts w:ascii="Calibri" w:eastAsia="Times New Roman" w:hAnsi="Calibri"/>
+          <w:color w:val="1D3248"/>
+          <w:sz w:val="18"/>
+          <w:szCs w:val="18"/>
+          <w:lang w:val="de-DE"/>
+        </w:rPr>
+      </w:pPr>
+      <w:r>
+        <w:rPr>
+          <w:rFonts w:ascii="Calibri" w:eastAsia="Times New Roman" w:hAnsi="Calibri"/>
+          <w:color w:val="1D3248"/>
+          <w:sz w:val="18"/>
+          <w:szCs w:val="18"/>
+          <w:lang w:val="de-DE"/>
+        </w:rPr>
+        <w:t>2025 – heut</w:t>
+      </w:r>
+      <w:r>
+        <w:rPr>
+          <w:rFonts w:ascii="Calibri" w:eastAsia="Times New Roman" w:hAnsi="Calibri"/>
+          <w:color w:val="1D3248"/>
+          <w:sz w:val="18"/>
+          <w:szCs w:val="18"/>
+          <w:lang w:val="de-DE"/>
+        </w:rPr>
+        <w:t>e</w:t>
+      </w:r>
+    </w:p>
+    <w:p>
+      <w:pPr>
+        <w:divId w:val="381516069"/>
         <w:rPr>
           <w:rFonts w:ascii="Calibri" w:eastAsia="Times New Roman" w:hAnsi="Calibri"/>
           <w:b/>
@@ -777,7 +777,7 @@
           <w:szCs w:val="17"/>
           <w:lang w:val="de-DE"/>
         </w:rPr>
-        <w:t>Swisscom Schweiz AG · Bern</w:t>
+        <w:t>Bern · studienbegleitend · www.marcelspahr.ch</w:t>
       </w:r>
     </w:p>
     <w:p>
@@ -787,7 +787,7 @@
           <w:numId w:val="1"/>
         </w:numPr>
         <w:spacing w:after="40"/>
-        <w:divId w:val="2133206538"/>
+        <w:divId w:val="1815683597"/>
         <w:rPr>
           <w:rFonts w:ascii="Calibri" w:eastAsia="Times New Roman" w:hAnsi="Calibri"/>
           <w:color w:val="405970"/>
@@ -804,7 +804,7 @@
           <w:szCs w:val="18"/>
           <w:lang w:val="de-DE"/>
         </w:rPr>
-        <w:t>Selbständige Bearbeitung komplexer Kundenanliegen über Telefon, E-Mail, Brief und Chat sowie strukturierte Analyse individueller Problemstellungen.</w:t>
+        <w:t>Konzeption und Entwicklung digitaler Lösungen von der Anforderungsanalyse über UX/UI bis zu Frontend, Backend, Datenmodell, Testing und Betrieb.</w:t>
       </w:r>
     </w:p>
     <w:p>
@@ -814,7 +814,7 @@
           <w:numId w:val="1"/>
         </w:numPr>
         <w:spacing w:after="40"/>
-        <w:divId w:val="2133206538"/>
+        <w:divId w:val="1815683597"/>
         <w:rPr>
           <w:rFonts w:ascii="Calibri" w:eastAsia="Times New Roman" w:hAnsi="Calibri"/>
           <w:color w:val="405970"/>
@@ -831,7 +831,7 @@
           <w:szCs w:val="18"/>
           <w:lang w:val="de-DE"/>
         </w:rPr>
-        <w:t>End-to-End-Verantwortung im Wissensgebiet; Entwicklung von Lösungen und Workarounds in der Prozess- und Systemlandschaft.</w:t>
+        <w:t>Direkte Zusammenarbeit mit Auftraggebenden; Übersetzung fachlicher Bedürfnisse in verständliche Konzepte, skalierbare Prozesse und nutzbare Anwendungen.</w:t>
       </w:r>
     </w:p>
     <w:p>
@@ -841,7 +841,7 @@
           <w:numId w:val="1"/>
         </w:numPr>
         <w:spacing w:after="40"/>
-        <w:divId w:val="2133206538"/>
+        <w:divId w:val="1815683597"/>
         <w:rPr>
           <w:rFonts w:ascii="Calibri" w:eastAsia="Times New Roman" w:hAnsi="Calibri"/>
           <w:color w:val="405970"/>
@@ -858,7 +858,7 @@
           <w:szCs w:val="18"/>
           <w:lang w:val="de-DE"/>
         </w:rPr>
-        <w:t>Unterstützung operativer Einheiten in Projekt- und Prozessmanagement, aktiver Wissenstransfer sowie Umsetzung von Verbesserungsideen.</w:t>
+        <w:t>Projektverantwortung für Websites, Webanwendungen, Portale, Datenbanken und Automatisierungen; ausgewählte Arbeiten: VeraHome, GiGi Beauty und LIQUODA.</w:t>
       </w:r>
     </w:p>
     <w:p>
@@ -868,7 +868,7 @@
           <w:numId w:val="1"/>
         </w:numPr>
         <w:spacing w:after="40"/>
-        <w:divId w:val="2133206538"/>
+        <w:divId w:val="1815683597"/>
         <w:rPr>
           <w:rFonts w:ascii="Calibri" w:eastAsia="Times New Roman" w:hAnsi="Calibri"/>
           <w:color w:val="405970"/>
@@ -885,13 +885,13 @@
           <w:szCs w:val="18"/>
           <w:lang w:val="de-DE"/>
         </w:rPr>
-        <w:t>Vernetzte Zusammenarbeit mit unterschiedlichen Stakeholdern mit Fokus auf Kundenerlebnis und nachhaltige Geschäftsergebnisse.</w:t>
+        <w:t>Parallel zum HF-Studium aufgebaut; ab sofort offen für eine Festanstellung mit 80–100 %.</w:t>
       </w:r>
     </w:p>
     <w:p>
       <w:pPr>
         <w:pStyle w:val="berschrift3"/>
-        <w:divId w:val="1010640534"/>
+        <w:divId w:val="1163660666"/>
         <w:rPr>
           <w:rFonts w:ascii="Calibri" w:eastAsia="Times New Roman" w:hAnsi="Calibri"/>
           <w:color w:val="1D3248"/>
@@ -905,44 +905,44 @@
           <w:lang w:val="de-DE"/>
         </w:rPr>
         <w:lastRenderedPageBreak/>
-        <w:t>Frühere Funktionen in Kundenservice und technischem Support</w:t>
-      </w:r>
-    </w:p>
-    <w:p>
-      <w:pPr>
-        <w:divId w:val="1010640534"/>
-        <w:rPr>
-          <w:rFonts w:ascii="Calibri" w:eastAsia="Times New Roman" w:hAnsi="Calibri"/>
-          <w:color w:val="1D3248"/>
-          <w:sz w:val="18"/>
-          <w:szCs w:val="18"/>
-          <w:lang w:val="de-DE"/>
-        </w:rPr>
-      </w:pPr>
-      <w:r>
-        <w:rPr>
-          <w:rFonts w:ascii="Calibri" w:eastAsia="Times New Roman" w:hAnsi="Calibri"/>
-          <w:color w:val="1D3248"/>
-          <w:sz w:val="18"/>
-          <w:szCs w:val="18"/>
-          <w:lang w:val="de-DE"/>
-        </w:rPr>
-        <w:t>09/2008 – 07/201</w:t>
-      </w:r>
-      <w:r>
-        <w:rPr>
-          <w:rFonts w:ascii="Calibri" w:eastAsia="Times New Roman" w:hAnsi="Calibri"/>
-          <w:color w:val="1D3248"/>
-          <w:sz w:val="18"/>
-          <w:szCs w:val="18"/>
-          <w:lang w:val="de-DE"/>
-        </w:rPr>
-        <w:t>6</w:t>
-      </w:r>
-    </w:p>
-    <w:p>
-      <w:pPr>
-        <w:divId w:val="1256942559"/>
+        <w:t>Customer Consultant, Bereich Specials</w:t>
+      </w:r>
+    </w:p>
+    <w:p>
+      <w:pPr>
+        <w:divId w:val="1163660666"/>
+        <w:rPr>
+          <w:rFonts w:ascii="Calibri" w:eastAsia="Times New Roman" w:hAnsi="Calibri"/>
+          <w:color w:val="1D3248"/>
+          <w:sz w:val="18"/>
+          <w:szCs w:val="18"/>
+          <w:lang w:val="de-DE"/>
+        </w:rPr>
+      </w:pPr>
+      <w:r>
+        <w:rPr>
+          <w:rFonts w:ascii="Calibri" w:eastAsia="Times New Roman" w:hAnsi="Calibri"/>
+          <w:color w:val="1D3248"/>
+          <w:sz w:val="18"/>
+          <w:szCs w:val="18"/>
+          <w:lang w:val="de-DE"/>
+        </w:rPr>
+        <w:t>08/2016 – 04/202</w:t>
+      </w:r>
+      <w:r>
+        <w:rPr>
+          <w:rFonts w:ascii="Calibri" w:eastAsia="Times New Roman" w:hAnsi="Calibri"/>
+          <w:color w:val="1D3248"/>
+          <w:sz w:val="18"/>
+          <w:szCs w:val="18"/>
+          <w:lang w:val="de-DE"/>
+        </w:rPr>
+        <w:t>5</w:t>
+      </w:r>
+    </w:p>
+    <w:p>
+      <w:pPr>
+        <w:divId w:val="58024096"/>
         <w:rPr>
           <w:rFonts w:ascii="Calibri" w:eastAsia="Times New Roman" w:hAnsi="Calibri"/>
           <w:b/>
@@ -973,7 +973,7 @@
           <w:numId w:val="2"/>
         </w:numPr>
         <w:spacing w:after="40"/>
-        <w:divId w:val="2133206538"/>
+        <w:divId w:val="1815683597"/>
         <w:rPr>
           <w:rFonts w:ascii="Calibri" w:eastAsia="Times New Roman" w:hAnsi="Calibri"/>
           <w:color w:val="405970"/>
@@ -990,14 +990,531 @@
           <w:szCs w:val="18"/>
           <w:lang w:val="de-DE"/>
         </w:rPr>
+        <w:t>Selbständige Bearbeitung komplexer Kundenanliegen über Telefon, E-Mail, Brief und Chat sowie strukturierte Analyse individueller Problemstellungen.</w:t>
+      </w:r>
+    </w:p>
+    <w:p>
+      <w:pPr>
+        <w:numPr>
+          <w:ilvl w:val="0"/>
+          <w:numId w:val="2"/>
+        </w:numPr>
+        <w:spacing w:after="40"/>
+        <w:divId w:val="1815683597"/>
+        <w:rPr>
+          <w:rFonts w:ascii="Calibri" w:eastAsia="Times New Roman" w:hAnsi="Calibri"/>
+          <w:color w:val="405970"/>
+          <w:sz w:val="18"/>
+          <w:szCs w:val="18"/>
+          <w:lang w:val="de-DE"/>
+        </w:rPr>
+      </w:pPr>
+      <w:r>
+        <w:rPr>
+          <w:rFonts w:ascii="Calibri" w:eastAsia="Times New Roman" w:hAnsi="Calibri"/>
+          <w:color w:val="405970"/>
+          <w:sz w:val="18"/>
+          <w:szCs w:val="18"/>
+          <w:lang w:val="de-DE"/>
+        </w:rPr>
+        <w:t>End-to-End-Verantwortung im Wissensgebiet; Entwicklung von Lösungen und Workarounds in der Prozess- und Systemlandschaft.</w:t>
+      </w:r>
+    </w:p>
+    <w:p>
+      <w:pPr>
+        <w:numPr>
+          <w:ilvl w:val="0"/>
+          <w:numId w:val="2"/>
+        </w:numPr>
+        <w:spacing w:after="40"/>
+        <w:divId w:val="1815683597"/>
+        <w:rPr>
+          <w:rFonts w:ascii="Calibri" w:eastAsia="Times New Roman" w:hAnsi="Calibri"/>
+          <w:color w:val="405970"/>
+          <w:sz w:val="18"/>
+          <w:szCs w:val="18"/>
+          <w:lang w:val="de-DE"/>
+        </w:rPr>
+      </w:pPr>
+      <w:r>
+        <w:rPr>
+          <w:rFonts w:ascii="Calibri" w:eastAsia="Times New Roman" w:hAnsi="Calibri"/>
+          <w:color w:val="405970"/>
+          <w:sz w:val="18"/>
+          <w:szCs w:val="18"/>
+          <w:lang w:val="de-DE"/>
+        </w:rPr>
+        <w:t>Unterstützung operativer Einheiten in Projekt- und Prozessmanagement, aktiver Wissenstransfer sowie Umsetzung von Verbesserungsideen.</w:t>
+      </w:r>
+    </w:p>
+    <w:p>
+      <w:pPr>
+        <w:numPr>
+          <w:ilvl w:val="0"/>
+          <w:numId w:val="2"/>
+        </w:numPr>
+        <w:spacing w:after="40"/>
+        <w:divId w:val="1815683597"/>
+        <w:rPr>
+          <w:rFonts w:ascii="Calibri" w:eastAsia="Times New Roman" w:hAnsi="Calibri"/>
+          <w:color w:val="405970"/>
+          <w:sz w:val="18"/>
+          <w:szCs w:val="18"/>
+          <w:lang w:val="de-DE"/>
+        </w:rPr>
+      </w:pPr>
+      <w:r>
+        <w:rPr>
+          <w:rFonts w:ascii="Calibri" w:eastAsia="Times New Roman" w:hAnsi="Calibri"/>
+          <w:color w:val="405970"/>
+          <w:sz w:val="18"/>
+          <w:szCs w:val="18"/>
+          <w:lang w:val="de-DE"/>
+        </w:rPr>
+        <w:t>Vernetzte Zusammenarbeit mit unterschiedlichen Stakeholdern mit Fokus auf Kundenerlebnis und nachhaltige Geschäftsergebnisse.</w:t>
+      </w:r>
+    </w:p>
+    <w:p>
+      <w:pPr>
+        <w:pStyle w:val="berschrift3"/>
+        <w:divId w:val="1210460460"/>
+        <w:rPr>
+          <w:rFonts w:ascii="Calibri" w:eastAsia="Times New Roman" w:hAnsi="Calibri"/>
+          <w:color w:val="1D3248"/>
+          <w:lang w:val="de-DE"/>
+        </w:rPr>
+      </w:pPr>
+      <w:r>
+        <w:rPr>
+          <w:rFonts w:ascii="Calibri" w:eastAsia="Times New Roman" w:hAnsi="Calibri"/>
+          <w:color w:val="1D3248"/>
+          <w:lang w:val="de-DE"/>
+        </w:rPr>
+        <w:t>Frühere Funktionen in Kundenservice und technischem Support</w:t>
+      </w:r>
+    </w:p>
+    <w:p>
+      <w:pPr>
+        <w:divId w:val="1210460460"/>
+        <w:rPr>
+          <w:rFonts w:ascii="Calibri" w:eastAsia="Times New Roman" w:hAnsi="Calibri"/>
+          <w:color w:val="1D3248"/>
+          <w:sz w:val="18"/>
+          <w:szCs w:val="18"/>
+          <w:lang w:val="de-DE"/>
+        </w:rPr>
+      </w:pPr>
+      <w:r>
+        <w:rPr>
+          <w:rFonts w:ascii="Calibri" w:eastAsia="Times New Roman" w:hAnsi="Calibri"/>
+          <w:color w:val="1D3248"/>
+          <w:sz w:val="18"/>
+          <w:szCs w:val="18"/>
+          <w:lang w:val="de-DE"/>
+        </w:rPr>
+        <w:t>09/2008 – 07/201</w:t>
+      </w:r>
+      <w:r>
+        <w:rPr>
+          <w:rFonts w:ascii="Calibri" w:eastAsia="Times New Roman" w:hAnsi="Calibri"/>
+          <w:color w:val="1D3248"/>
+          <w:sz w:val="18"/>
+          <w:szCs w:val="18"/>
+          <w:lang w:val="de-DE"/>
+        </w:rPr>
+        <w:t>6</w:t>
+      </w:r>
+    </w:p>
+    <w:p>
+      <w:pPr>
+        <w:divId w:val="2115131316"/>
+        <w:rPr>
+          <w:rFonts w:ascii="Calibri" w:eastAsia="Times New Roman" w:hAnsi="Calibri"/>
+          <w:b/>
+          <w:bCs/>
+          <w:color w:val="245F98"/>
+          <w:sz w:val="17"/>
+          <w:szCs w:val="17"/>
+          <w:lang w:val="de-DE"/>
+        </w:rPr>
+      </w:pPr>
+      <w:r>
+        <w:rPr>
+          <w:rFonts w:ascii="Calibri" w:eastAsia="Times New Roman" w:hAnsi="Calibri"/>
+          <w:b/>
+          <w:bCs/>
+          <w:color w:val="245F98"/>
+          <w:sz w:val="17"/>
+          <w:szCs w:val="17"/>
+          <w:lang w:val="de-DE"/>
+        </w:rPr>
+        <w:t>Swisscom Schweiz AG · Bern</w:t>
+      </w:r>
+    </w:p>
+    <w:p>
+      <w:pPr>
+        <w:numPr>
+          <w:ilvl w:val="0"/>
+          <w:numId w:val="3"/>
+        </w:numPr>
+        <w:spacing w:after="40"/>
+        <w:divId w:val="1815683597"/>
+        <w:rPr>
+          <w:rFonts w:ascii="Calibri" w:eastAsia="Times New Roman" w:hAnsi="Calibri"/>
+          <w:color w:val="405970"/>
+          <w:sz w:val="18"/>
+          <w:szCs w:val="18"/>
+          <w:lang w:val="de-DE"/>
+        </w:rPr>
+      </w:pPr>
+      <w:r>
+        <w:rPr>
+          <w:rFonts w:ascii="Calibri" w:eastAsia="Times New Roman" w:hAnsi="Calibri"/>
+          <w:color w:val="405970"/>
+          <w:sz w:val="18"/>
+          <w:szCs w:val="18"/>
+          <w:lang w:val="de-DE"/>
+        </w:rPr>
         <w:t>Aufbau einer breiten Praxisbasis in technischer Fehleranalyse, Eskalationsbearbeitung, Kundenkommunikation und nachhaltiger Problemlösung.</w:t>
+      </w:r>
+    </w:p>
+    <w:p>
+      <w:pPr>
+        <w:divId w:val="1686438620"/>
+        <w:rPr>
+          <w:rFonts w:ascii="Calibri" w:eastAsia="Times New Roman" w:hAnsi="Calibri"/>
+          <w:color w:val="7B8DA0"/>
+          <w:sz w:val="14"/>
+          <w:szCs w:val="14"/>
+          <w:lang w:val="de-DE"/>
+        </w:rPr>
+      </w:pPr>
+      <w:r>
+        <w:rPr>
+          <w:rFonts w:ascii="Calibri" w:eastAsia="Times New Roman" w:hAnsi="Calibri"/>
+          <w:color w:val="7B8DA0"/>
+          <w:sz w:val="14"/>
+          <w:szCs w:val="14"/>
+          <w:lang w:val="de-DE"/>
+        </w:rPr>
+        <w:t>Lebenslauf · Marcel Spahr · Stand Juli 20261 / 2</w:t>
+      </w:r>
+    </w:p>
+    <w:p>
+      <w:pPr>
+        <w:pStyle w:val="berschrift2"/>
+        <w:spacing w:before="0" w:beforeAutospacing="0" w:after="170" w:afterAutospacing="0"/>
+        <w:rPr>
+          <w:rFonts w:ascii="Calibri" w:eastAsia="Times New Roman" w:hAnsi="Calibri"/>
+          <w:caps/>
+          <w:color w:val="102A43"/>
+          <w:spacing w:val="19"/>
+          <w:sz w:val="21"/>
+          <w:szCs w:val="21"/>
+          <w:lang w:val="de-DE"/>
+        </w:rPr>
+      </w:pPr>
+      <w:r>
+        <w:rPr>
+          <w:rFonts w:ascii="Calibri" w:eastAsia="Times New Roman" w:hAnsi="Calibri"/>
+          <w:caps/>
+          <w:color w:val="102A43"/>
+          <w:spacing w:val="19"/>
+          <w:sz w:val="21"/>
+          <w:szCs w:val="21"/>
+          <w:lang w:val="de-DE"/>
+        </w:rPr>
+        <w:t>Ausbildung &amp; Diplomarbeit</w:t>
       </w:r>
     </w:p>
     <w:p>
       <w:pPr>
         <w:shd w:val="clear" w:color="auto" w:fill="F3F7FB"/>
         <w:outlineLvl w:val="3"/>
-        <w:divId w:val="1494222631"/>
+        <w:divId w:val="385031032"/>
+        <w:rPr>
+          <w:rFonts w:ascii="Calibri" w:eastAsia="Times New Roman" w:hAnsi="Calibri"/>
+          <w:b/>
+          <w:bCs/>
+          <w:color w:val="102A43"/>
+          <w:sz w:val="22"/>
+          <w:szCs w:val="22"/>
+          <w:lang w:val="de-DE"/>
+        </w:rPr>
+      </w:pPr>
+      <w:r>
+        <w:rPr>
+          <w:rFonts w:ascii="Calibri" w:eastAsia="Times New Roman" w:hAnsi="Calibri"/>
+          <w:b/>
+          <w:bCs/>
+          <w:color w:val="102A43"/>
+          <w:sz w:val="22"/>
+          <w:szCs w:val="22"/>
+          <w:lang w:val="de-DE"/>
+        </w:rPr>
+        <w:t>Wirtschaftsinformatik HF · Abschlussphase</w:t>
+      </w:r>
+    </w:p>
+    <w:p>
+      <w:pPr>
+        <w:shd w:val="clear" w:color="auto" w:fill="F3F7FB"/>
+        <w:divId w:val="763769087"/>
+        <w:rPr>
+          <w:rFonts w:ascii="Calibri" w:eastAsia="Times New Roman" w:hAnsi="Calibri"/>
+          <w:b/>
+          <w:bCs/>
+          <w:color w:val="245F98"/>
+          <w:sz w:val="18"/>
+          <w:szCs w:val="18"/>
+          <w:lang w:val="de-DE"/>
+        </w:rPr>
+      </w:pPr>
+      <w:r>
+        <w:rPr>
+          <w:rFonts w:ascii="Calibri" w:eastAsia="Times New Roman" w:hAnsi="Calibri"/>
+          <w:b/>
+          <w:bCs/>
+          <w:color w:val="245F98"/>
+          <w:sz w:val="18"/>
+          <w:szCs w:val="18"/>
+          <w:lang w:val="de-DE"/>
+        </w:rPr>
+        <w:t>HF Feusi Bildungszentrum, Bern · 2023–2026 · aktueller Notendurchschnitt 5,6</w:t>
+      </w:r>
+    </w:p>
+    <w:p>
+      <w:pPr>
+        <w:shd w:val="clear" w:color="auto" w:fill="F3F7FB"/>
+        <w:spacing w:before="113"/>
+        <w:divId w:val="385031032"/>
+        <w:rPr>
+          <w:rFonts w:ascii="Calibri" w:hAnsi="Calibri"/>
+          <w:color w:val="405970"/>
+          <w:sz w:val="18"/>
+          <w:szCs w:val="18"/>
+          <w:lang w:val="de-DE"/>
+        </w:rPr>
+      </w:pPr>
+      <w:r>
+        <w:rPr>
+          <w:rFonts w:ascii="Calibri" w:hAnsi="Calibri"/>
+          <w:color w:val="405970"/>
+          <w:sz w:val="18"/>
+          <w:szCs w:val="18"/>
+          <w:lang w:val="de-DE"/>
+        </w:rPr>
+        <w:t>Schwerpunkte: Requirements Engineering, Prozessmanagement und BPMN, SQL und Datenbanken, Projektmanagement mit Scrum, digitale Transformation, IT-Architekturen, Informationssysteme, Datenanalyse und Reporting sowie IT-Service-Management.</w:t>
+      </w:r>
+    </w:p>
+    <w:p>
+      <w:pPr>
+        <w:shd w:val="clear" w:color="auto" w:fill="FFFFFF"/>
+        <w:divId w:val="1127506272"/>
+        <w:rPr>
+          <w:rFonts w:ascii="Calibri" w:eastAsia="Times New Roman" w:hAnsi="Calibri"/>
+          <w:color w:val="1D3248"/>
+          <w:sz w:val="18"/>
+          <w:szCs w:val="18"/>
+          <w:lang w:val="de-DE"/>
+        </w:rPr>
+      </w:pPr>
+      <w:r>
+        <w:rPr>
+          <w:rFonts w:ascii="Calibri" w:eastAsia="Times New Roman" w:hAnsi="Calibri"/>
+          <w:b/>
+          <w:bCs/>
+          <w:color w:val="245F98"/>
+          <w:sz w:val="16"/>
+          <w:szCs w:val="16"/>
+          <w:lang w:val="de-DE"/>
+        </w:rPr>
+        <w:t>Juni 2026</w:t>
+      </w:r>
+      <w:r>
+        <w:rPr>
+          <w:rFonts w:ascii="Calibri" w:eastAsia="Times New Roman" w:hAnsi="Calibri"/>
+          <w:color w:val="405970"/>
+          <w:sz w:val="16"/>
+          <w:szCs w:val="16"/>
+          <w:lang w:val="de-DE"/>
+        </w:rPr>
+        <w:t>Diplomarbeit eingereicht; Bewertung ausstehend.</w:t>
+      </w:r>
+    </w:p>
+    <w:p>
+      <w:pPr>
+        <w:shd w:val="clear" w:color="auto" w:fill="FFFFFF"/>
+        <w:divId w:val="932281614"/>
+        <w:rPr>
+          <w:rFonts w:ascii="Calibri" w:eastAsia="Times New Roman" w:hAnsi="Calibri"/>
+          <w:color w:val="1D3248"/>
+          <w:sz w:val="18"/>
+          <w:szCs w:val="18"/>
+          <w:lang w:val="de-DE"/>
+        </w:rPr>
+      </w:pPr>
+      <w:r>
+        <w:rPr>
+          <w:rFonts w:ascii="Calibri" w:eastAsia="Times New Roman" w:hAnsi="Calibri"/>
+          <w:b/>
+          <w:bCs/>
+          <w:color w:val="245F98"/>
+          <w:sz w:val="16"/>
+          <w:szCs w:val="16"/>
+          <w:lang w:val="de-DE"/>
+        </w:rPr>
+        <w:t>4. August 2026</w:t>
+      </w:r>
+      <w:r>
+        <w:rPr>
+          <w:rFonts w:ascii="Calibri" w:eastAsia="Times New Roman" w:hAnsi="Calibri"/>
+          <w:color w:val="405970"/>
+          <w:sz w:val="16"/>
+          <w:szCs w:val="16"/>
+          <w:lang w:val="de-DE"/>
+        </w:rPr>
+        <w:t>Präsentation der Diplomarbeit und mündliche Prüfung.</w:t>
+      </w:r>
+    </w:p>
+    <w:p>
+      <w:pPr>
+        <w:shd w:val="clear" w:color="auto" w:fill="FFFFFF"/>
+        <w:divId w:val="713698888"/>
+        <w:rPr>
+          <w:rFonts w:ascii="Calibri" w:eastAsia="Times New Roman" w:hAnsi="Calibri"/>
+          <w:color w:val="1D3248"/>
+          <w:sz w:val="18"/>
+          <w:szCs w:val="18"/>
+          <w:lang w:val="de-DE"/>
+        </w:rPr>
+      </w:pPr>
+      <w:r>
+        <w:rPr>
+          <w:rFonts w:ascii="Calibri" w:eastAsia="Times New Roman" w:hAnsi="Calibri"/>
+          <w:b/>
+          <w:bCs/>
+          <w:color w:val="245F98"/>
+          <w:sz w:val="16"/>
+          <w:szCs w:val="16"/>
+          <w:lang w:val="de-DE"/>
+        </w:rPr>
+        <w:t>Bis Ende August</w:t>
+      </w:r>
+      <w:r>
+        <w:rPr>
+          <w:rFonts w:ascii="Calibri" w:eastAsia="Times New Roman" w:hAnsi="Calibri"/>
+          <w:color w:val="405970"/>
+          <w:sz w:val="16"/>
+          <w:szCs w:val="16"/>
+          <w:lang w:val="de-DE"/>
+        </w:rPr>
+        <w:t>Diplomierung bei erfolgreichem Abschluss voraussichtlich bis Ende August 2026.</w:t>
+      </w:r>
+    </w:p>
+    <w:p>
+      <w:pPr>
+        <w:shd w:val="clear" w:color="auto" w:fill="F3F7FB"/>
+        <w:outlineLvl w:val="3"/>
+        <w:divId w:val="1561788538"/>
+        <w:rPr>
+          <w:rFonts w:ascii="Calibri" w:eastAsia="Times New Roman" w:hAnsi="Calibri"/>
+          <w:b/>
+          <w:bCs/>
+          <w:color w:val="245F98"/>
+          <w:sz w:val="20"/>
+          <w:szCs w:val="20"/>
+          <w:lang w:val="de-DE"/>
+        </w:rPr>
+      </w:pPr>
+      <w:r>
+        <w:rPr>
+          <w:rFonts w:ascii="Calibri" w:eastAsia="Times New Roman" w:hAnsi="Calibri"/>
+          <w:b/>
+          <w:bCs/>
+          <w:color w:val="245F98"/>
+          <w:sz w:val="20"/>
+          <w:szCs w:val="20"/>
+          <w:lang w:val="de-DE"/>
+        </w:rPr>
+        <w:t>Diplomarbeit: LIQUODA</w:t>
+      </w:r>
+    </w:p>
+    <w:p>
+      <w:pPr>
+        <w:shd w:val="clear" w:color="auto" w:fill="F3F7FB"/>
+        <w:divId w:val="1561788538"/>
+        <w:rPr>
+          <w:rFonts w:ascii="Calibri" w:eastAsia="Times New Roman" w:hAnsi="Calibri"/>
+          <w:color w:val="1D3248"/>
+          <w:sz w:val="18"/>
+          <w:szCs w:val="18"/>
+          <w:lang w:val="de-DE"/>
+        </w:rPr>
+      </w:pPr>
+      <w:r>
+        <w:rPr>
+          <w:rStyle w:val="tag2"/>
+          <w:rFonts w:ascii="Calibri" w:eastAsia="Times New Roman" w:hAnsi="Calibri"/>
+          <w:color w:val="245F98"/>
+          <w:lang w:val="de-DE"/>
+        </w:rPr>
+        <w:t>Einzelarbeit · 9 Interviews · IREB-orientiert</w:t>
+      </w:r>
+    </w:p>
+    <w:p>
+      <w:pPr>
+        <w:shd w:val="clear" w:color="auto" w:fill="F3F7FB"/>
+        <w:spacing w:before="85"/>
+        <w:divId w:val="1039624057"/>
+        <w:rPr>
+          <w:rFonts w:ascii="Calibri" w:hAnsi="Calibri"/>
+          <w:color w:val="405970"/>
+          <w:sz w:val="17"/>
+          <w:szCs w:val="17"/>
+          <w:lang w:val="de-DE"/>
+        </w:rPr>
+      </w:pPr>
+      <w:r>
+        <w:rPr>
+          <w:rStyle w:val="Fett"/>
+          <w:rFonts w:ascii="Calibri" w:hAnsi="Calibri"/>
+          <w:color w:val="405970"/>
+          <w:sz w:val="17"/>
+          <w:szCs w:val="17"/>
+          <w:lang w:val="de-DE"/>
+        </w:rPr>
+        <w:t>«Detailkonzept und Anforderungsanalyse der tokenisierten Vermittlungsplattform LIQUODA»</w:t>
+      </w:r>
+    </w:p>
+    <w:p>
+      <w:pPr>
+        <w:shd w:val="clear" w:color="auto" w:fill="F3F7FB"/>
+        <w:spacing w:before="85"/>
+        <w:divId w:val="1039624057"/>
+        <w:rPr>
+          <w:rFonts w:ascii="Calibri" w:hAnsi="Calibri"/>
+          <w:color w:val="405970"/>
+          <w:sz w:val="17"/>
+          <w:szCs w:val="17"/>
+          <w:lang w:val="de-DE"/>
+        </w:rPr>
+      </w:pPr>
+      <w:r>
+        <w:rPr>
+          <w:rFonts w:ascii="Calibri" w:hAnsi="Calibri"/>
+          <w:color w:val="405970"/>
+          <w:sz w:val="17"/>
+          <w:szCs w:val="17"/>
+          <w:lang w:val="de-DE"/>
+        </w:rPr>
+        <w:t>Stakeholder-Analyse, Erhebung und Kategorisierung funktionaler und nicht-funktionaler Anforderungen, Priorisierung sowie systematische Analyse von Vertrauensbarrieren. Ergebnis sind ein priorisierter Anforderungskatalog, eine abgeleitete MVP-Definition und ein am Fallbeispiel LIQUODA validiertes Detailkonzept als Grundlage für den geplanten realen Plattformaufbau.</w:t>
+      </w:r>
+    </w:p>
+    <w:p>
+      <w:pPr>
+        <w:shd w:val="clear" w:color="auto" w:fill="F3F7FB"/>
+        <w:outlineLvl w:val="3"/>
+        <w:divId w:val="956375618"/>
         <w:rPr>
           <w:rFonts w:ascii="Calibri" w:eastAsia="Times New Roman" w:hAnsi="Calibri"/>
           <w:b/>
@@ -1024,7 +1541,7 @@
     <w:p>
       <w:pPr>
         <w:shd w:val="clear" w:color="auto" w:fill="F3F7FB"/>
-        <w:divId w:val="1494222631"/>
+        <w:divId w:val="956375618"/>
         <w:rPr>
           <w:rFonts w:ascii="Calibri" w:eastAsia="Times New Roman" w:hAnsi="Calibri"/>
           <w:color w:val="1D3248"/>
@@ -1045,31 +1562,7 @@
     <w:p>
       <w:pPr>
         <w:shd w:val="clear" w:color="auto" w:fill="F3F7FB"/>
-        <w:spacing w:before="85"/>
-        <w:divId w:val="380596146"/>
-        <w:rPr>
-          <w:rFonts w:ascii="Calibri" w:hAnsi="Calibri"/>
-          <w:color w:val="405970"/>
-          <w:sz w:val="17"/>
-          <w:szCs w:val="17"/>
-          <w:lang w:val="de-DE"/>
-        </w:rPr>
-      </w:pPr>
-      <w:r>
-        <w:rPr>
-          <w:rFonts w:ascii="Calibri" w:hAnsi="Calibri"/>
-          <w:color w:val="405970"/>
-          <w:sz w:val="17"/>
-          <w:szCs w:val="17"/>
-          <w:lang w:val="de-DE"/>
-        </w:rPr>
-        <w:t>Mitentwicklung einer produktiven Lösung, mit der technische Kundenanfragen in Swisscom Shops strukturiert erfasst und automatisiert an den nächsten freien Tech-Support-Mitarbeitenden im zentralen CRM geroutet werden.</w:t>
-      </w:r>
-    </w:p>
-    <w:p>
-      <w:pPr>
-        <w:shd w:val="clear" w:color="auto" w:fill="F3F7FB"/>
-        <w:divId w:val="1731806971"/>
+        <w:divId w:val="1226335293"/>
         <w:rPr>
           <w:rFonts w:ascii="Calibri" w:eastAsia="Times New Roman" w:hAnsi="Calibri"/>
           <w:color w:val="405970"/>
@@ -1114,7 +1607,7 @@
     <w:p>
       <w:pPr>
         <w:shd w:val="clear" w:color="auto" w:fill="F3F7FB"/>
-        <w:divId w:val="389040386"/>
+        <w:divId w:val="638924169"/>
         <w:rPr>
           <w:rFonts w:ascii="Calibri" w:eastAsia="Times New Roman" w:hAnsi="Calibri"/>
           <w:color w:val="405970"/>
@@ -1143,35 +1636,14 @@
           <w:szCs w:val="16"/>
           <w:lang w:val="de-DE"/>
         </w:rPr>
-        <w:t xml:space="preserve"> Nach Erprobung in fünf Pilotshops schweizweiter Rollout auf alle Swisscom Shops; vorbereitete Rückrufe statt Hotline-Wartezeit.</w:t>
-      </w:r>
-    </w:p>
-    <w:p>
-      <w:pPr>
-        <w:divId w:val="462432767"/>
-        <w:rPr>
-          <w:rFonts w:ascii="Calibri" w:eastAsia="Times New Roman" w:hAnsi="Calibri"/>
-          <w:color w:val="7B8DA0"/>
-          <w:sz w:val="14"/>
-          <w:szCs w:val="14"/>
-          <w:lang w:val="de-DE"/>
-        </w:rPr>
-      </w:pPr>
-      <w:r>
-        <w:rPr>
-          <w:rFonts w:ascii="Calibri" w:eastAsia="Times New Roman" w:hAnsi="Calibri"/>
-          <w:color w:val="7B8DA0"/>
-          <w:sz w:val="14"/>
-          <w:szCs w:val="14"/>
-          <w:lang w:val="de-DE"/>
-        </w:rPr>
-        <w:t>Lebenslauf · Marcel Spahr · Stand Juli 20261 / 2</w:t>
+        <w:t xml:space="preserve"> Produktive Routing-Lösung für technische Shop-Anfragen; nach fünf Pilotshops schweizweiter Rollout auf alle Swisscom Shops.</w:t>
       </w:r>
     </w:p>
     <w:p>
       <w:pPr>
         <w:pStyle w:val="berschrift2"/>
         <w:spacing w:before="0" w:beforeAutospacing="0" w:after="170" w:afterAutospacing="0"/>
+        <w:divId w:val="21640311"/>
         <w:rPr>
           <w:rFonts w:ascii="Calibri" w:eastAsia="Times New Roman" w:hAnsi="Calibri"/>
           <w:caps/>
@@ -1192,72 +1664,57 @@
           <w:szCs w:val="21"/>
           <w:lang w:val="de-DE"/>
         </w:rPr>
-        <w:t>Ausbildung &amp; Diplomarbeit</w:t>
-      </w:r>
-    </w:p>
-    <w:p>
-      <w:pPr>
-        <w:shd w:val="clear" w:color="auto" w:fill="F3F7FB"/>
-        <w:outlineLvl w:val="3"/>
-        <w:divId w:val="990331428"/>
-        <w:rPr>
-          <w:rFonts w:ascii="Calibri" w:eastAsia="Times New Roman" w:hAnsi="Calibri"/>
-          <w:b/>
-          <w:bCs/>
-          <w:color w:val="102A43"/>
-          <w:sz w:val="22"/>
-          <w:szCs w:val="22"/>
-          <w:lang w:val="de-DE"/>
-        </w:rPr>
-      </w:pPr>
-      <w:r>
-        <w:rPr>
-          <w:rFonts w:ascii="Calibri" w:eastAsia="Times New Roman" w:hAnsi="Calibri"/>
-          <w:b/>
-          <w:bCs/>
-          <w:color w:val="102A43"/>
-          <w:sz w:val="22"/>
-          <w:szCs w:val="22"/>
-          <w:lang w:val="de-DE"/>
-        </w:rPr>
-        <w:t>Wirtschaftsinformatik HF · Abschlussphase</w:t>
-      </w:r>
-    </w:p>
-    <w:p>
-      <w:pPr>
-        <w:shd w:val="clear" w:color="auto" w:fill="F3F7FB"/>
-        <w:divId w:val="866722008"/>
-        <w:rPr>
-          <w:rFonts w:ascii="Calibri" w:eastAsia="Times New Roman" w:hAnsi="Calibri"/>
-          <w:b/>
-          <w:bCs/>
-          <w:color w:val="245F98"/>
-          <w:sz w:val="18"/>
-          <w:szCs w:val="18"/>
-          <w:lang w:val="de-DE"/>
-        </w:rPr>
-      </w:pPr>
-      <w:r>
-        <w:rPr>
-          <w:rFonts w:ascii="Calibri" w:eastAsia="Times New Roman" w:hAnsi="Calibri"/>
-          <w:b/>
-          <w:bCs/>
-          <w:color w:val="245F98"/>
-          <w:sz w:val="18"/>
-          <w:szCs w:val="18"/>
-          <w:lang w:val="de-DE"/>
-        </w:rPr>
-        <w:t>HF Feusi Bildungszentrum, Bern · 2023–2026 · aktueller Notendurchschnitt 5,6</w:t>
-      </w:r>
-    </w:p>
-    <w:p>
-      <w:pPr>
-        <w:shd w:val="clear" w:color="auto" w:fill="F3F7FB"/>
-        <w:spacing w:before="113"/>
-        <w:divId w:val="990331428"/>
+        <w:t>Weitere Berufspraxis</w:t>
+      </w:r>
+    </w:p>
+    <w:p>
+      <w:pPr>
+        <w:pStyle w:val="berschrift3"/>
+        <w:divId w:val="21640311"/>
+        <w:rPr>
+          <w:rFonts w:ascii="Calibri" w:eastAsia="Times New Roman" w:hAnsi="Calibri"/>
+          <w:color w:val="1D3248"/>
+          <w:lang w:val="de-DE"/>
+        </w:rPr>
+      </w:pPr>
+      <w:r>
+        <w:rPr>
+          <w:rFonts w:ascii="Calibri" w:eastAsia="Times New Roman" w:hAnsi="Calibri"/>
+          <w:color w:val="1D3248"/>
+          <w:lang w:val="de-DE"/>
+        </w:rPr>
+        <w:t>Cube Club Bern · Inhaber und Geschäftsführer</w:t>
+      </w:r>
+    </w:p>
+    <w:p>
+      <w:pPr>
+        <w:divId w:val="1080567253"/>
+        <w:rPr>
+          <w:rFonts w:ascii="Calibri" w:eastAsia="Times New Roman" w:hAnsi="Calibri"/>
+          <w:color w:val="1D3248"/>
+          <w:sz w:val="18"/>
+          <w:szCs w:val="18"/>
+          <w:lang w:val="de-DE"/>
+        </w:rPr>
+      </w:pPr>
+      <w:r>
+        <w:rPr>
+          <w:rFonts w:ascii="Calibri" w:eastAsia="Times New Roman" w:hAnsi="Calibri"/>
+          <w:color w:val="1D3248"/>
+          <w:sz w:val="18"/>
+          <w:szCs w:val="18"/>
+          <w:lang w:val="de-DE"/>
+        </w:rPr>
+        <w:t>2018–2020 · zeitweise bis zu 18 Mitarbeitende</w:t>
+      </w:r>
+    </w:p>
+    <w:p>
+      <w:pPr>
+        <w:pStyle w:val="StandardWeb"/>
+        <w:divId w:val="21640311"/>
         <w:rPr>
           <w:rFonts w:ascii="Calibri" w:hAnsi="Calibri"/>
-          <w:color w:val="405970"/>
+          <w:color w:val="1D3248"/>
           <w:sz w:val="18"/>
           <w:szCs w:val="18"/>
           <w:lang w:val="de-DE"/>
@@ -1266,223 +1723,84 @@
       <w:r>
         <w:rPr>
           <w:rFonts w:ascii="Calibri" w:hAnsi="Calibri"/>
-          <w:color w:val="405970"/>
-          <w:sz w:val="18"/>
-          <w:szCs w:val="18"/>
-          <w:lang w:val="de-DE"/>
-        </w:rPr>
-        <w:t>Schwerpunkte: Requirements Engineering, Prozessmanagement und BPMN, SQL und Datenbanken, Projektmanagement mit Scrum, digitale Transformation, IT-Architekturen, Informationssysteme, Datenanalyse und Reporting sowie IT-Service-Management.</w:t>
-      </w:r>
-    </w:p>
-    <w:p>
-      <w:pPr>
-        <w:shd w:val="clear" w:color="auto" w:fill="FFFFFF"/>
-        <w:divId w:val="223300485"/>
-        <w:rPr>
-          <w:rFonts w:ascii="Calibri" w:eastAsia="Times New Roman" w:hAnsi="Calibri"/>
-          <w:color w:val="1D3248"/>
-          <w:sz w:val="18"/>
-          <w:szCs w:val="18"/>
-          <w:lang w:val="de-DE"/>
-        </w:rPr>
-      </w:pPr>
-      <w:r>
-        <w:rPr>
-          <w:rFonts w:ascii="Calibri" w:eastAsia="Times New Roman" w:hAnsi="Calibri"/>
-          <w:b/>
-          <w:bCs/>
-          <w:color w:val="245F98"/>
-          <w:sz w:val="16"/>
-          <w:szCs w:val="16"/>
-          <w:lang w:val="de-DE"/>
-        </w:rPr>
-        <w:t>Juni 2026</w:t>
-      </w:r>
-      <w:r>
-        <w:rPr>
-          <w:rFonts w:ascii="Calibri" w:eastAsia="Times New Roman" w:hAnsi="Calibri"/>
-          <w:color w:val="405970"/>
-          <w:sz w:val="16"/>
-          <w:szCs w:val="16"/>
-          <w:lang w:val="de-DE"/>
-        </w:rPr>
-        <w:t>Diplomarbeit eingereicht; Bewertung ausstehend.</w:t>
-      </w:r>
-    </w:p>
-    <w:p>
-      <w:pPr>
-        <w:shd w:val="clear" w:color="auto" w:fill="FFFFFF"/>
-        <w:divId w:val="1037046926"/>
-        <w:rPr>
-          <w:rFonts w:ascii="Calibri" w:eastAsia="Times New Roman" w:hAnsi="Calibri"/>
-          <w:color w:val="1D3248"/>
-          <w:sz w:val="18"/>
-          <w:szCs w:val="18"/>
-          <w:lang w:val="de-DE"/>
-        </w:rPr>
-      </w:pPr>
-      <w:r>
-        <w:rPr>
-          <w:rFonts w:ascii="Calibri" w:eastAsia="Times New Roman" w:hAnsi="Calibri"/>
-          <w:b/>
-          <w:bCs/>
-          <w:color w:val="245F98"/>
-          <w:sz w:val="16"/>
-          <w:szCs w:val="16"/>
-          <w:lang w:val="de-DE"/>
-        </w:rPr>
-        <w:t>4. August 2026</w:t>
-      </w:r>
-      <w:r>
-        <w:rPr>
-          <w:rFonts w:ascii="Calibri" w:eastAsia="Times New Roman" w:hAnsi="Calibri"/>
-          <w:color w:val="405970"/>
-          <w:sz w:val="16"/>
-          <w:szCs w:val="16"/>
-          <w:lang w:val="de-DE"/>
-        </w:rPr>
-        <w:t>Präsentation der Diplomarbeit und mündliche Prüfung.</w:t>
-      </w:r>
-    </w:p>
-    <w:p>
-      <w:pPr>
-        <w:shd w:val="clear" w:color="auto" w:fill="FFFFFF"/>
-        <w:divId w:val="304048365"/>
-        <w:rPr>
-          <w:rFonts w:ascii="Calibri" w:eastAsia="Times New Roman" w:hAnsi="Calibri"/>
-          <w:color w:val="1D3248"/>
-          <w:sz w:val="18"/>
-          <w:szCs w:val="18"/>
-          <w:lang w:val="de-DE"/>
-        </w:rPr>
-      </w:pPr>
-      <w:r>
-        <w:rPr>
-          <w:rFonts w:ascii="Calibri" w:eastAsia="Times New Roman" w:hAnsi="Calibri"/>
-          <w:b/>
-          <w:bCs/>
-          <w:color w:val="245F98"/>
-          <w:sz w:val="16"/>
-          <w:szCs w:val="16"/>
-          <w:lang w:val="de-DE"/>
-        </w:rPr>
-        <w:t>Bis Ende August</w:t>
-      </w:r>
-      <w:r>
-        <w:rPr>
-          <w:rFonts w:ascii="Calibri" w:eastAsia="Times New Roman" w:hAnsi="Calibri"/>
-          <w:color w:val="405970"/>
-          <w:sz w:val="16"/>
-          <w:szCs w:val="16"/>
-          <w:lang w:val="de-DE"/>
-        </w:rPr>
-        <w:t>Diplomierung bei erfolgreichem Abschluss voraussichtlich bis Ende August 2026.</w:t>
-      </w:r>
-    </w:p>
-    <w:p>
-      <w:pPr>
-        <w:shd w:val="clear" w:color="auto" w:fill="F3F7FB"/>
-        <w:outlineLvl w:val="3"/>
-        <w:divId w:val="1951668186"/>
-        <w:rPr>
-          <w:rFonts w:ascii="Calibri" w:eastAsia="Times New Roman" w:hAnsi="Calibri"/>
-          <w:b/>
-          <w:bCs/>
-          <w:color w:val="245F98"/>
-          <w:sz w:val="20"/>
-          <w:szCs w:val="20"/>
-          <w:lang w:val="de-DE"/>
-        </w:rPr>
-      </w:pPr>
-      <w:r>
-        <w:rPr>
-          <w:rFonts w:ascii="Calibri" w:eastAsia="Times New Roman" w:hAnsi="Calibri"/>
-          <w:b/>
-          <w:bCs/>
-          <w:color w:val="245F98"/>
-          <w:sz w:val="20"/>
-          <w:szCs w:val="20"/>
-          <w:lang w:val="de-DE"/>
-        </w:rPr>
-        <w:t>Diplomarbeit: LIQUODA</w:t>
-      </w:r>
-    </w:p>
-    <w:p>
-      <w:pPr>
-        <w:shd w:val="clear" w:color="auto" w:fill="F3F7FB"/>
-        <w:divId w:val="1951668186"/>
-        <w:rPr>
-          <w:rFonts w:ascii="Calibri" w:eastAsia="Times New Roman" w:hAnsi="Calibri"/>
-          <w:color w:val="1D3248"/>
-          <w:sz w:val="18"/>
-          <w:szCs w:val="18"/>
-          <w:lang w:val="de-DE"/>
-        </w:rPr>
-      </w:pPr>
-      <w:r>
-        <w:rPr>
-          <w:rStyle w:val="tag2"/>
-          <w:rFonts w:ascii="Calibri" w:eastAsia="Times New Roman" w:hAnsi="Calibri"/>
-          <w:color w:val="245F98"/>
-          <w:lang w:val="de-DE"/>
-        </w:rPr>
-        <w:t>Einzelarbeit · 9 Interviews · IREB-orientiert</w:t>
-      </w:r>
-    </w:p>
-    <w:p>
-      <w:pPr>
-        <w:shd w:val="clear" w:color="auto" w:fill="F3F7FB"/>
-        <w:spacing w:before="85"/>
-        <w:divId w:val="305939552"/>
+          <w:color w:val="1D3248"/>
+          <w:sz w:val="18"/>
+          <w:szCs w:val="18"/>
+          <w:lang w:val="de-DE"/>
+        </w:rPr>
+        <w:t>Operative Leitung mit Verantwortung für Organisation, Personal, Finanzen, Partnerkommunikation und zuverlässigen Veranstaltungsbetrieb.</w:t>
+      </w:r>
+    </w:p>
+    <w:p>
+      <w:pPr>
+        <w:pStyle w:val="berschrift3"/>
+        <w:divId w:val="21640311"/>
+        <w:rPr>
+          <w:rFonts w:ascii="Calibri" w:eastAsia="Times New Roman" w:hAnsi="Calibri"/>
+          <w:color w:val="1D3248"/>
+          <w:lang w:val="de-DE"/>
+        </w:rPr>
+      </w:pPr>
+      <w:r>
+        <w:rPr>
+          <w:rFonts w:ascii="Calibri" w:eastAsia="Times New Roman" w:hAnsi="Calibri"/>
+          <w:color w:val="1D3248"/>
+          <w:lang w:val="de-DE"/>
+        </w:rPr>
+        <w:t>Werbetechnik · Frontwork Zürich / Seka Thun</w:t>
+      </w:r>
+    </w:p>
+    <w:p>
+      <w:pPr>
+        <w:divId w:val="1908880969"/>
+        <w:rPr>
+          <w:rFonts w:ascii="Calibri" w:eastAsia="Times New Roman" w:hAnsi="Calibri"/>
+          <w:color w:val="1D3248"/>
+          <w:sz w:val="18"/>
+          <w:szCs w:val="18"/>
+          <w:lang w:val="de-DE"/>
+        </w:rPr>
+      </w:pPr>
+      <w:r>
+        <w:rPr>
+          <w:rFonts w:ascii="Calibri" w:eastAsia="Times New Roman" w:hAnsi="Calibri"/>
+          <w:color w:val="1D3248"/>
+          <w:sz w:val="18"/>
+          <w:szCs w:val="18"/>
+          <w:lang w:val="de-DE"/>
+        </w:rPr>
+        <w:lastRenderedPageBreak/>
+        <w:t>2007–2008</w:t>
+      </w:r>
+    </w:p>
+    <w:p>
+      <w:pPr>
+        <w:pStyle w:val="StandardWeb"/>
+        <w:divId w:val="21640311"/>
         <w:rPr>
           <w:rFonts w:ascii="Calibri" w:hAnsi="Calibri"/>
-          <w:color w:val="405970"/>
-          <w:sz w:val="17"/>
-          <w:szCs w:val="17"/>
-          <w:lang w:val="de-DE"/>
-        </w:rPr>
-      </w:pPr>
-      <w:r>
-        <w:rPr>
-          <w:rStyle w:val="Fett"/>
+          <w:color w:val="1D3248"/>
+          <w:sz w:val="18"/>
+          <w:szCs w:val="18"/>
+          <w:lang w:val="de-DE"/>
+        </w:rPr>
+      </w:pPr>
+      <w:r>
+        <w:rPr>
           <w:rFonts w:ascii="Calibri" w:hAnsi="Calibri"/>
-          <w:color w:val="405970"/>
-          <w:sz w:val="17"/>
-          <w:szCs w:val="17"/>
-          <w:lang w:val="de-DE"/>
-        </w:rPr>
-        <w:t>«Detailkonzept und Anforderungsanalyse der tokenisierten Vermittlungsplattform LIQUODA»</w:t>
-      </w:r>
-    </w:p>
-    <w:p>
-      <w:pPr>
-        <w:shd w:val="clear" w:color="auto" w:fill="F3F7FB"/>
-        <w:spacing w:before="85"/>
-        <w:divId w:val="305939552"/>
-        <w:rPr>
-          <w:rFonts w:ascii="Calibri" w:hAnsi="Calibri"/>
-          <w:color w:val="405970"/>
-          <w:sz w:val="17"/>
-          <w:szCs w:val="17"/>
-          <w:lang w:val="de-DE"/>
-        </w:rPr>
-      </w:pPr>
-      <w:r>
-        <w:rPr>
-          <w:rFonts w:ascii="Calibri" w:hAnsi="Calibri"/>
-          <w:color w:val="405970"/>
-          <w:sz w:val="17"/>
-          <w:szCs w:val="17"/>
-          <w:lang w:val="de-DE"/>
-        </w:rPr>
-        <w:t>Stakeholder-Analyse, Erhebung und Kategorisierung funktionaler und nicht-funktionaler Anforderungen, Priorisierung sowie systematische Analyse von Vertrauensbarrieren. Ergebnis sind ein priorisierter Anforderungskatalog, eine abgeleitete MVP-Definition und ein am Fallbeispiel LIQUODA validiertes Detailkonzept als Grundlage für den geplanten realen Plattformaufbau.</w:t>
+          <w:color w:val="1D3248"/>
+          <w:sz w:val="18"/>
+          <w:szCs w:val="18"/>
+          <w:lang w:val="de-DE"/>
+        </w:rPr>
+        <w:t>Umsetzung zeitkritischer Markenprojekte rund um die EURO 2008 und das Redesign von Swisscom Shops.</w:t>
       </w:r>
     </w:p>
     <w:p>
       <w:pPr>
         <w:pStyle w:val="berschrift2"/>
         <w:spacing w:before="0" w:beforeAutospacing="0" w:after="170" w:afterAutospacing="0"/>
-        <w:divId w:val="1426994190"/>
+        <w:divId w:val="21640311"/>
         <w:rPr>
           <w:rFonts w:ascii="Calibri" w:eastAsia="Times New Roman" w:hAnsi="Calibri"/>
           <w:caps/>
@@ -1503,206 +1821,146 @@
           <w:szCs w:val="21"/>
           <w:lang w:val="de-DE"/>
         </w:rPr>
-        <w:t>Ausgewählte Projektpraxis</w:t>
-      </w:r>
-    </w:p>
-    <w:p>
-      <w:pPr>
-        <w:pStyle w:val="berschrift3"/>
-        <w:divId w:val="1426994190"/>
-        <w:rPr>
-          <w:rFonts w:ascii="Calibri" w:eastAsia="Times New Roman" w:hAnsi="Calibri"/>
-          <w:color w:val="1D3248"/>
-          <w:lang w:val="de-DE"/>
-        </w:rPr>
-      </w:pPr>
-      <w:r>
-        <w:rPr>
-          <w:rFonts w:ascii="Calibri" w:eastAsia="Times New Roman" w:hAnsi="Calibri"/>
-          <w:color w:val="1D3248"/>
-          <w:lang w:val="de-DE"/>
-        </w:rPr>
-        <w:t>Digitale Eigen- und Kundenprojekte · seit 2024</w:t>
-      </w:r>
-    </w:p>
-    <w:p>
-      <w:pPr>
-        <w:divId w:val="583035120"/>
-        <w:rPr>
-          <w:rFonts w:ascii="Calibri" w:eastAsia="Times New Roman" w:hAnsi="Calibri"/>
-          <w:color w:val="1D3248"/>
-          <w:sz w:val="18"/>
-          <w:szCs w:val="18"/>
-          <w:lang w:val="de-DE"/>
-        </w:rPr>
-      </w:pPr>
-      <w:r>
-        <w:rPr>
-          <w:rFonts w:ascii="Calibri" w:eastAsia="Times New Roman" w:hAnsi="Calibri"/>
-          <w:color w:val="1D3248"/>
-          <w:sz w:val="18"/>
-          <w:szCs w:val="18"/>
-          <w:lang w:val="de-DE"/>
-        </w:rPr>
-        <w:t>Konzeption · UX/UI · Webentwicklung · Datenbanken · Automatisierung</w:t>
-      </w:r>
-    </w:p>
-    <w:p>
-      <w:pPr>
-        <w:pStyle w:val="StandardWeb"/>
-        <w:divId w:val="1426994190"/>
-        <w:rPr>
-          <w:rFonts w:ascii="Calibri" w:hAnsi="Calibri"/>
-          <w:color w:val="1D3248"/>
-          <w:sz w:val="18"/>
-          <w:szCs w:val="18"/>
-          <w:lang w:val="de-DE"/>
-        </w:rPr>
-      </w:pPr>
-      <w:r>
-        <w:rPr>
-          <w:rFonts w:ascii="Calibri" w:hAnsi="Calibri"/>
-          <w:color w:val="1D3248"/>
-          <w:sz w:val="18"/>
-          <w:szCs w:val="18"/>
-          <w:lang w:val="de-DE"/>
-        </w:rPr>
-        <w:t>Ganzheitliche Entwicklung digitaler Lösungen von der Anforderungsanalyse und Gestaltung bis zu Frontend, Backend, Datenmodell und Betrieb; darunter Immobilienverwaltung/CRM, Webplattformen und interaktive 3D-Websites.</w:t>
-      </w:r>
-    </w:p>
-    <w:p>
-      <w:pPr>
-        <w:pStyle w:val="berschrift3"/>
-        <w:divId w:val="1426994190"/>
-        <w:rPr>
-          <w:rFonts w:ascii="Calibri" w:eastAsia="Times New Roman" w:hAnsi="Calibri"/>
-          <w:color w:val="1D3248"/>
-          <w:lang w:val="de-DE"/>
-        </w:rPr>
-      </w:pPr>
-      <w:r>
-        <w:rPr>
-          <w:rFonts w:ascii="Calibri" w:eastAsia="Times New Roman" w:hAnsi="Calibri"/>
-          <w:color w:val="1D3248"/>
-          <w:lang w:val="de-DE"/>
-        </w:rPr>
-        <w:t>Cube Club Bern · Inhaber und Geschäftsführer</w:t>
-      </w:r>
-    </w:p>
-    <w:p>
-      <w:pPr>
-        <w:divId w:val="1693413585"/>
-        <w:rPr>
-          <w:rFonts w:ascii="Calibri" w:eastAsia="Times New Roman" w:hAnsi="Calibri"/>
-          <w:color w:val="1D3248"/>
-          <w:sz w:val="18"/>
-          <w:szCs w:val="18"/>
-          <w:lang w:val="de-DE"/>
-        </w:rPr>
-      </w:pPr>
-      <w:r>
-        <w:rPr>
-          <w:rFonts w:ascii="Calibri" w:eastAsia="Times New Roman" w:hAnsi="Calibri"/>
-          <w:color w:val="1D3248"/>
-          <w:sz w:val="18"/>
-          <w:szCs w:val="18"/>
-          <w:lang w:val="de-DE"/>
-        </w:rPr>
-        <w:t>2018–2020 · zeitweise bis zu 18 Mitarbeitende</w:t>
-      </w:r>
-    </w:p>
-    <w:p>
-      <w:pPr>
-        <w:pStyle w:val="StandardWeb"/>
-        <w:divId w:val="1426994190"/>
-        <w:rPr>
-          <w:rFonts w:ascii="Calibri" w:hAnsi="Calibri"/>
-          <w:color w:val="1D3248"/>
-          <w:sz w:val="18"/>
-          <w:szCs w:val="18"/>
-          <w:lang w:val="de-DE"/>
-        </w:rPr>
-      </w:pPr>
-      <w:r>
-        <w:rPr>
-          <w:rFonts w:ascii="Calibri" w:hAnsi="Calibri"/>
-          <w:color w:val="1D3248"/>
-          <w:sz w:val="18"/>
-          <w:szCs w:val="18"/>
-          <w:lang w:val="de-DE"/>
-        </w:rPr>
-        <w:t>Operative Leitung mit Verantwortung für Organisation, Personal, Finanzen, Partnerkommunikation und zuverlässigen Veranstaltungsbetrieb.</w:t>
-      </w:r>
-    </w:p>
-    <w:p>
-      <w:pPr>
-        <w:pStyle w:val="berschrift3"/>
-        <w:divId w:val="1426994190"/>
-        <w:rPr>
-          <w:rFonts w:ascii="Calibri" w:eastAsia="Times New Roman" w:hAnsi="Calibri"/>
-          <w:color w:val="1D3248"/>
-          <w:lang w:val="de-DE"/>
-        </w:rPr>
-      </w:pPr>
-      <w:r>
-        <w:rPr>
-          <w:rFonts w:ascii="Calibri" w:eastAsia="Times New Roman" w:hAnsi="Calibri"/>
-          <w:color w:val="1D3248"/>
-          <w:lang w:val="de-DE"/>
-        </w:rPr>
-        <w:t>Werbetechnik · Frontwork Zürich / Seka Thun</w:t>
-      </w:r>
-    </w:p>
-    <w:p>
-      <w:pPr>
-        <w:divId w:val="895242602"/>
-        <w:rPr>
-          <w:rFonts w:ascii="Calibri" w:eastAsia="Times New Roman" w:hAnsi="Calibri"/>
-          <w:color w:val="1D3248"/>
-          <w:sz w:val="18"/>
-          <w:szCs w:val="18"/>
-          <w:lang w:val="de-DE"/>
-        </w:rPr>
-      </w:pPr>
-      <w:r>
-        <w:rPr>
-          <w:rFonts w:ascii="Calibri" w:eastAsia="Times New Roman" w:hAnsi="Calibri"/>
-          <w:color w:val="1D3248"/>
-          <w:sz w:val="18"/>
-          <w:szCs w:val="18"/>
-          <w:lang w:val="de-DE"/>
-        </w:rPr>
-        <w:t>2007–2008</w:t>
-      </w:r>
-    </w:p>
-    <w:p>
-      <w:pPr>
-        <w:pStyle w:val="StandardWeb"/>
-        <w:divId w:val="1426994190"/>
-        <w:rPr>
-          <w:rFonts w:ascii="Calibri" w:hAnsi="Calibri"/>
-          <w:color w:val="1D3248"/>
-          <w:sz w:val="18"/>
-          <w:szCs w:val="18"/>
-          <w:lang w:val="de-DE"/>
-        </w:rPr>
-      </w:pPr>
-      <w:r>
-        <w:rPr>
-          <w:rFonts w:ascii="Calibri" w:hAnsi="Calibri"/>
-          <w:color w:val="1D3248"/>
-          <w:sz w:val="18"/>
-          <w:szCs w:val="18"/>
-          <w:lang w:val="de-DE"/>
-        </w:rPr>
-        <w:t>Umsetzung zeitkritischer Markenprojekte rund um die EURO 2008 und das Redesign von Swisscom Shops.</w:t>
+        <w:t>Weitere Abschlüsse</w:t>
+      </w:r>
+    </w:p>
+    <w:p>
+      <w:pPr>
+        <w:divId w:val="733625067"/>
+        <w:rPr>
+          <w:rFonts w:ascii="Calibri" w:eastAsia="Times New Roman" w:hAnsi="Calibri"/>
+          <w:color w:val="1D3248"/>
+          <w:sz w:val="18"/>
+          <w:szCs w:val="18"/>
+          <w:lang w:val="de-DE"/>
+        </w:rPr>
+      </w:pPr>
+      <w:r>
+        <w:rPr>
+          <w:rFonts w:ascii="Calibri" w:eastAsia="Times New Roman" w:hAnsi="Calibri"/>
+          <w:b/>
+          <w:bCs/>
+          <w:color w:val="20364D"/>
+          <w:sz w:val="17"/>
+          <w:szCs w:val="17"/>
+          <w:lang w:val="de-DE"/>
+        </w:rPr>
+        <w:t>Werbetechniker EFZ</w:t>
+      </w:r>
+      <w:r>
+        <w:rPr>
+          <w:rFonts w:ascii="Calibri" w:eastAsia="Times New Roman" w:hAnsi="Calibri"/>
+          <w:color w:val="65788C"/>
+          <w:sz w:val="15"/>
+          <w:szCs w:val="15"/>
+          <w:lang w:val="de-DE"/>
+        </w:rPr>
+        <w:t>Gestaltung, Marketing und Produktion</w:t>
+      </w:r>
+    </w:p>
+    <w:p>
+      <w:pPr>
+        <w:divId w:val="1437284765"/>
+        <w:rPr>
+          <w:rFonts w:ascii="Calibri" w:eastAsia="Times New Roman" w:hAnsi="Calibri"/>
+          <w:color w:val="1D3248"/>
+          <w:sz w:val="18"/>
+          <w:szCs w:val="18"/>
+          <w:lang w:val="de-DE"/>
+        </w:rPr>
+      </w:pPr>
+      <w:r>
+        <w:rPr>
+          <w:rFonts w:ascii="Calibri" w:eastAsia="Times New Roman" w:hAnsi="Calibri"/>
+          <w:color w:val="1D3248"/>
+          <w:sz w:val="18"/>
+          <w:szCs w:val="18"/>
+          <w:lang w:val="de-DE"/>
+        </w:rPr>
+        <w:t>200</w:t>
+      </w:r>
+      <w:r>
+        <w:rPr>
+          <w:rFonts w:ascii="Calibri" w:eastAsia="Times New Roman" w:hAnsi="Calibri"/>
+          <w:color w:val="1D3248"/>
+          <w:sz w:val="18"/>
+          <w:szCs w:val="18"/>
+          <w:lang w:val="de-DE"/>
+        </w:rPr>
+        <w:t>7</w:t>
+      </w:r>
+    </w:p>
+    <w:p>
+      <w:pPr>
+        <w:divId w:val="1700744293"/>
+        <w:rPr>
+          <w:rFonts w:ascii="Calibri" w:eastAsia="Times New Roman" w:hAnsi="Calibri"/>
+          <w:color w:val="1D3248"/>
+          <w:sz w:val="18"/>
+          <w:szCs w:val="18"/>
+          <w:lang w:val="de-DE"/>
+        </w:rPr>
+      </w:pPr>
+      <w:r>
+        <w:rPr>
+          <w:rFonts w:ascii="Calibri" w:eastAsia="Times New Roman" w:hAnsi="Calibri"/>
+          <w:b/>
+          <w:bCs/>
+          <w:color w:val="20364D"/>
+          <w:sz w:val="17"/>
+          <w:szCs w:val="17"/>
+          <w:lang w:val="de-DE"/>
+        </w:rPr>
+        <w:t>Maler EFZ</w:t>
+      </w:r>
+      <w:r>
+        <w:rPr>
+          <w:rFonts w:ascii="Calibri" w:eastAsia="Times New Roman" w:hAnsi="Calibri"/>
+          <w:color w:val="65788C"/>
+          <w:sz w:val="15"/>
+          <w:szCs w:val="15"/>
+          <w:lang w:val="de-DE"/>
+        </w:rPr>
+        <w:t>Qualität, Präzision und zuverlässige Ausführung</w:t>
+      </w:r>
+    </w:p>
+    <w:p>
+      <w:pPr>
+        <w:divId w:val="1728338009"/>
+        <w:rPr>
+          <w:rFonts w:ascii="Calibri" w:eastAsia="Times New Roman" w:hAnsi="Calibri"/>
+          <w:color w:val="1D3248"/>
+          <w:sz w:val="18"/>
+          <w:szCs w:val="18"/>
+          <w:lang w:val="de-DE"/>
+        </w:rPr>
+      </w:pPr>
+      <w:r>
+        <w:rPr>
+          <w:rFonts w:ascii="Calibri" w:eastAsia="Times New Roman" w:hAnsi="Calibri"/>
+          <w:color w:val="1D3248"/>
+          <w:sz w:val="18"/>
+          <w:szCs w:val="18"/>
+          <w:lang w:val="de-DE"/>
+        </w:rPr>
+        <w:t>200</w:t>
+      </w:r>
+      <w:r>
+        <w:rPr>
+          <w:rFonts w:ascii="Calibri" w:eastAsia="Times New Roman" w:hAnsi="Calibri"/>
+          <w:color w:val="1D3248"/>
+          <w:sz w:val="18"/>
+          <w:szCs w:val="18"/>
+          <w:lang w:val="de-DE"/>
+        </w:rPr>
+        <w:t>4</w:t>
       </w:r>
     </w:p>
     <w:p>
       <w:pPr>
         <w:pStyle w:val="berschrift2"/>
         <w:spacing w:before="0" w:beforeAutospacing="0" w:after="170" w:afterAutospacing="0"/>
-        <w:divId w:val="1426994190"/>
+        <w:divId w:val="2144612667"/>
         <w:rPr>
           <w:rFonts w:ascii="Calibri" w:eastAsia="Times New Roman" w:hAnsi="Calibri"/>
           <w:caps/>
@@ -1723,13 +1981,12 @@
           <w:szCs w:val="21"/>
           <w:lang w:val="de-DE"/>
         </w:rPr>
-        <w:lastRenderedPageBreak/>
-        <w:t>Weitere Abschlüsse</w:t>
-      </w:r>
-    </w:p>
-    <w:p>
-      <w:pPr>
-        <w:divId w:val="1609703441"/>
+        <w:t>Zertifizierungen</w:t>
+      </w:r>
+    </w:p>
+    <w:p>
+      <w:pPr>
+        <w:divId w:val="1467353748"/>
         <w:rPr>
           <w:rFonts w:ascii="Calibri" w:eastAsia="Times New Roman" w:hAnsi="Calibri"/>
           <w:color w:val="1D3248"/>
@@ -1748,7 +2005,7 @@
           <w:szCs w:val="17"/>
           <w:lang w:val="de-DE"/>
         </w:rPr>
-        <w:t>Werbetechniker EFZ</w:t>
+        <w:t>IREB CPRE Foundation Level</w:t>
       </w:r>
       <w:r>
         <w:rPr>
@@ -1758,44 +2015,44 @@
           <w:szCs w:val="15"/>
           <w:lang w:val="de-DE"/>
         </w:rPr>
-        <w:t>Gestaltung, Marketing und Produktion</w:t>
-      </w:r>
-    </w:p>
-    <w:p>
-      <w:pPr>
-        <w:divId w:val="1338538665"/>
-        <w:rPr>
-          <w:rFonts w:ascii="Calibri" w:eastAsia="Times New Roman" w:hAnsi="Calibri"/>
-          <w:color w:val="1D3248"/>
-          <w:sz w:val="18"/>
-          <w:szCs w:val="18"/>
-          <w:lang w:val="de-DE"/>
-        </w:rPr>
-      </w:pPr>
-      <w:r>
-        <w:rPr>
-          <w:rFonts w:ascii="Calibri" w:eastAsia="Times New Roman" w:hAnsi="Calibri"/>
-          <w:color w:val="1D3248"/>
-          <w:sz w:val="18"/>
-          <w:szCs w:val="18"/>
-          <w:lang w:val="de-DE"/>
-        </w:rPr>
-        <w:t>200</w:t>
-      </w:r>
-      <w:r>
-        <w:rPr>
-          <w:rFonts w:ascii="Calibri" w:eastAsia="Times New Roman" w:hAnsi="Calibri"/>
-          <w:color w:val="1D3248"/>
-          <w:sz w:val="18"/>
-          <w:szCs w:val="18"/>
-          <w:lang w:val="de-DE"/>
-        </w:rPr>
-        <w:t>7</w:t>
-      </w:r>
-    </w:p>
-    <w:p>
-      <w:pPr>
-        <w:divId w:val="1062363587"/>
+        <w:t>Offiziell bestandene Zertifikatsprüfung · SAQ/IREB</w:t>
+      </w:r>
+    </w:p>
+    <w:p>
+      <w:pPr>
+        <w:divId w:val="1794130738"/>
+        <w:rPr>
+          <w:rFonts w:ascii="Calibri" w:eastAsia="Times New Roman" w:hAnsi="Calibri"/>
+          <w:color w:val="1D3248"/>
+          <w:sz w:val="18"/>
+          <w:szCs w:val="18"/>
+          <w:lang w:val="de-DE"/>
+        </w:rPr>
+      </w:pPr>
+      <w:r>
+        <w:rPr>
+          <w:rFonts w:ascii="Calibri" w:eastAsia="Times New Roman" w:hAnsi="Calibri"/>
+          <w:color w:val="1D3248"/>
+          <w:sz w:val="18"/>
+          <w:szCs w:val="18"/>
+          <w:lang w:val="de-DE"/>
+        </w:rPr>
+        <w:t>06/202</w:t>
+      </w:r>
+      <w:r>
+        <w:rPr>
+          <w:rFonts w:ascii="Calibri" w:eastAsia="Times New Roman" w:hAnsi="Calibri"/>
+          <w:color w:val="1D3248"/>
+          <w:sz w:val="18"/>
+          <w:szCs w:val="18"/>
+          <w:lang w:val="de-DE"/>
+        </w:rPr>
+        <w:t>6</w:t>
+      </w:r>
+    </w:p>
+    <w:p>
+      <w:pPr>
+        <w:divId w:val="2039819307"/>
         <w:rPr>
           <w:rFonts w:ascii="Calibri" w:eastAsia="Times New Roman" w:hAnsi="Calibri"/>
           <w:color w:val="1D3248"/>
@@ -1814,7 +2071,7 @@
           <w:szCs w:val="17"/>
           <w:lang w:val="de-DE"/>
         </w:rPr>
-        <w:t>Maler EFZ</w:t>
+        <w:t>SAFe 6 Agilist</w:t>
       </w:r>
       <w:r>
         <w:rPr>
@@ -1824,29 +2081,95 @@
           <w:szCs w:val="15"/>
           <w:lang w:val="de-DE"/>
         </w:rPr>
-        <w:t>Qualität, Präzision und zuverlässige Ausführung</w:t>
-      </w:r>
-    </w:p>
-    <w:p>
-      <w:pPr>
-        <w:divId w:val="224339529"/>
-        <w:rPr>
-          <w:rFonts w:ascii="Calibri" w:eastAsia="Times New Roman" w:hAnsi="Calibri"/>
-          <w:color w:val="1D3248"/>
-          <w:sz w:val="18"/>
-          <w:szCs w:val="18"/>
-          <w:lang w:val="de-DE"/>
-        </w:rPr>
-      </w:pPr>
-      <w:r>
-        <w:rPr>
-          <w:rFonts w:ascii="Calibri" w:eastAsia="Times New Roman" w:hAnsi="Calibri"/>
-          <w:color w:val="1D3248"/>
-          <w:sz w:val="18"/>
-          <w:szCs w:val="18"/>
-          <w:lang w:val="de-DE"/>
-        </w:rPr>
-        <w:t>200</w:t>
+        <w:t>Scaled Agile · gültig bis 11/2026</w:t>
+      </w:r>
+    </w:p>
+    <w:p>
+      <w:pPr>
+        <w:divId w:val="1930776145"/>
+        <w:rPr>
+          <w:rFonts w:ascii="Calibri" w:eastAsia="Times New Roman" w:hAnsi="Calibri"/>
+          <w:color w:val="1D3248"/>
+          <w:sz w:val="18"/>
+          <w:szCs w:val="18"/>
+          <w:lang w:val="de-DE"/>
+        </w:rPr>
+      </w:pPr>
+      <w:r>
+        <w:rPr>
+          <w:rFonts w:ascii="Calibri" w:eastAsia="Times New Roman" w:hAnsi="Calibri"/>
+          <w:color w:val="1D3248"/>
+          <w:sz w:val="18"/>
+          <w:szCs w:val="18"/>
+          <w:lang w:val="de-DE"/>
+        </w:rPr>
+        <w:t>202</w:t>
+      </w:r>
+      <w:r>
+        <w:rPr>
+          <w:rFonts w:ascii="Calibri" w:eastAsia="Times New Roman" w:hAnsi="Calibri"/>
+          <w:color w:val="1D3248"/>
+          <w:sz w:val="18"/>
+          <w:szCs w:val="18"/>
+          <w:lang w:val="de-DE"/>
+        </w:rPr>
+        <w:t>5</w:t>
+      </w:r>
+    </w:p>
+    <w:p>
+      <w:pPr>
+        <w:divId w:val="189757813"/>
+        <w:rPr>
+          <w:rFonts w:ascii="Calibri" w:eastAsia="Times New Roman" w:hAnsi="Calibri"/>
+          <w:color w:val="1D3248"/>
+          <w:sz w:val="18"/>
+          <w:szCs w:val="18"/>
+          <w:lang w:val="de-DE"/>
+        </w:rPr>
+      </w:pPr>
+      <w:r>
+        <w:rPr>
+          <w:rFonts w:ascii="Calibri" w:eastAsia="Times New Roman" w:hAnsi="Calibri"/>
+          <w:b/>
+          <w:bCs/>
+          <w:color w:val="20364D"/>
+          <w:sz w:val="17"/>
+          <w:szCs w:val="17"/>
+          <w:lang w:val="de-DE"/>
+        </w:rPr>
+        <w:t>Professional Scrum Master I</w:t>
+      </w:r>
+      <w:r>
+        <w:rPr>
+          <w:rFonts w:ascii="Calibri" w:eastAsia="Times New Roman" w:hAnsi="Calibri"/>
+          <w:color w:val="65788C"/>
+          <w:sz w:val="15"/>
+          <w:szCs w:val="15"/>
+          <w:lang w:val="de-DE"/>
+        </w:rPr>
+        <w:t>Scrum.org · PSM I</w:t>
+      </w:r>
+    </w:p>
+    <w:p>
+      <w:pPr>
+        <w:divId w:val="818762496"/>
+        <w:rPr>
+          <w:rFonts w:ascii="Calibri" w:eastAsia="Times New Roman" w:hAnsi="Calibri"/>
+          <w:color w:val="1D3248"/>
+          <w:sz w:val="18"/>
+          <w:szCs w:val="18"/>
+          <w:lang w:val="de-DE"/>
+        </w:rPr>
+      </w:pPr>
+      <w:r>
+        <w:rPr>
+          <w:rFonts w:ascii="Calibri" w:eastAsia="Times New Roman" w:hAnsi="Calibri"/>
+          <w:color w:val="1D3248"/>
+          <w:sz w:val="18"/>
+          <w:szCs w:val="18"/>
+          <w:lang w:val="de-DE"/>
+        </w:rPr>
+        <w:t>09/202</w:t>
       </w:r>
       <w:r>
         <w:rPr>
@@ -1857,13 +2180,79 @@
           <w:lang w:val="de-DE"/>
         </w:rPr>
         <w:t>4</w:t>
+      </w:r>
+    </w:p>
+    <w:p>
+      <w:pPr>
+        <w:divId w:val="1052732243"/>
+        <w:rPr>
+          <w:rFonts w:ascii="Calibri" w:eastAsia="Times New Roman" w:hAnsi="Calibri"/>
+          <w:color w:val="1D3248"/>
+          <w:sz w:val="18"/>
+          <w:szCs w:val="18"/>
+          <w:lang w:val="de-DE"/>
+        </w:rPr>
+      </w:pPr>
+      <w:r>
+        <w:rPr>
+          <w:rFonts w:ascii="Calibri" w:eastAsia="Times New Roman" w:hAnsi="Calibri"/>
+          <w:b/>
+          <w:bCs/>
+          <w:color w:val="20364D"/>
+          <w:sz w:val="17"/>
+          <w:szCs w:val="17"/>
+          <w:lang w:val="de-DE"/>
+        </w:rPr>
+        <w:t>Cambridge English A2</w:t>
+      </w:r>
+      <w:r>
+        <w:rPr>
+          <w:rFonts w:ascii="Calibri" w:eastAsia="Times New Roman" w:hAnsi="Calibri"/>
+          <w:color w:val="65788C"/>
+          <w:sz w:val="15"/>
+          <w:szCs w:val="15"/>
+          <w:lang w:val="de-DE"/>
+        </w:rPr>
+        <w:t>Gesamtergebnis 136</w:t>
+      </w:r>
+    </w:p>
+    <w:p>
+      <w:pPr>
+        <w:divId w:val="1942906473"/>
+        <w:rPr>
+          <w:rFonts w:ascii="Calibri" w:eastAsia="Times New Roman" w:hAnsi="Calibri"/>
+          <w:color w:val="1D3248"/>
+          <w:sz w:val="18"/>
+          <w:szCs w:val="18"/>
+          <w:lang w:val="de-DE"/>
+        </w:rPr>
+      </w:pPr>
+      <w:r>
+        <w:rPr>
+          <w:rFonts w:ascii="Calibri" w:eastAsia="Times New Roman" w:hAnsi="Calibri"/>
+          <w:color w:val="1D3248"/>
+          <w:sz w:val="18"/>
+          <w:szCs w:val="18"/>
+          <w:lang w:val="de-DE"/>
+        </w:rPr>
+        <w:t>202</w:t>
+      </w:r>
+      <w:r>
+        <w:rPr>
+          <w:rFonts w:ascii="Calibri" w:eastAsia="Times New Roman" w:hAnsi="Calibri"/>
+          <w:color w:val="1D3248"/>
+          <w:sz w:val="18"/>
+          <w:szCs w:val="18"/>
+          <w:lang w:val="de-DE"/>
+        </w:rPr>
+        <w:t>5</w:t>
       </w:r>
     </w:p>
     <w:p>
       <w:pPr>
         <w:pStyle w:val="berschrift2"/>
         <w:spacing w:before="0" w:beforeAutospacing="0" w:after="170" w:afterAutospacing="0"/>
-        <w:divId w:val="954412652"/>
+        <w:divId w:val="2144612667"/>
         <w:rPr>
           <w:rFonts w:ascii="Calibri" w:eastAsia="Times New Roman" w:hAnsi="Calibri"/>
           <w:caps/>
@@ -1884,12 +2273,91 @@
           <w:szCs w:val="21"/>
           <w:lang w:val="de-DE"/>
         </w:rPr>
-        <w:t>Zertifizierungen</w:t>
-      </w:r>
-    </w:p>
-    <w:p>
-      <w:pPr>
-        <w:divId w:val="628512790"/>
+        <w:t>Methoden &amp; Werkzeuge</w:t>
+      </w:r>
+    </w:p>
+    <w:p>
+      <w:pPr>
+        <w:divId w:val="2053721975"/>
+        <w:rPr>
+          <w:rFonts w:ascii="Calibri" w:eastAsia="Times New Roman" w:hAnsi="Calibri"/>
+          <w:color w:val="1D3248"/>
+          <w:sz w:val="18"/>
+          <w:szCs w:val="18"/>
+          <w:lang w:val="de-DE"/>
+        </w:rPr>
+      </w:pPr>
+      <w:r>
+        <w:rPr>
+          <w:rFonts w:ascii="Calibri" w:eastAsia="Times New Roman" w:hAnsi="Calibri"/>
+          <w:color w:val="405970"/>
+          <w:sz w:val="15"/>
+          <w:szCs w:val="15"/>
+          <w:bdr w:val="single" w:sz="6" w:space="4" w:color="D7E1EC" w:frame="1"/>
+          <w:lang w:val="de-DE"/>
+        </w:rPr>
+        <w:t>IREBBPMNScrumSAFeUser StoriesUse CasesAkzeptanzkriterienTestdesignJira*Confluence*Trello*SQLPostgreSQLNext.js/ReactSupabaseMicrosoft 365Adobe CC</w:t>
+      </w:r>
+      <w:r>
+        <w:rPr>
+          <w:rFonts w:ascii="Calibri" w:eastAsia="Times New Roman" w:hAnsi="Calibri"/>
+          <w:color w:val="1D3248"/>
+          <w:sz w:val="18"/>
+          <w:szCs w:val="18"/>
+          <w:lang w:val="de-DE"/>
+        </w:rPr>
+        <w:t xml:space="preserve"> </w:t>
+      </w:r>
+    </w:p>
+    <w:p>
+      <w:pPr>
+        <w:pStyle w:val="small-note"/>
+        <w:spacing w:after="100" w:afterAutospacing="1"/>
+        <w:divId w:val="2144612667"/>
+        <w:rPr>
+          <w:rFonts w:ascii="Calibri" w:hAnsi="Calibri"/>
+          <w:lang w:val="de-DE"/>
+        </w:rPr>
+      </w:pPr>
+      <w:r>
+        <w:rPr>
+          <w:rFonts w:ascii="Calibri" w:hAnsi="Calibri"/>
+          <w:lang w:val="de-DE"/>
+        </w:rPr>
+        <w:t>* Anwendung im Studium und in Projektarbeiten; nicht als Werkzeugnachweis für das X-ITE-Projekt ausgewiesen.</w:t>
+      </w:r>
+    </w:p>
+    <w:p>
+      <w:pPr>
+        <w:pStyle w:val="berschrift2"/>
+        <w:spacing w:before="0" w:beforeAutospacing="0" w:after="170" w:afterAutospacing="0"/>
+        <w:divId w:val="2144612667"/>
+        <w:rPr>
+          <w:rFonts w:ascii="Calibri" w:eastAsia="Times New Roman" w:hAnsi="Calibri"/>
+          <w:caps/>
+          <w:color w:val="102A43"/>
+          <w:spacing w:val="19"/>
+          <w:sz w:val="21"/>
+          <w:szCs w:val="21"/>
+          <w:lang w:val="de-DE"/>
+        </w:rPr>
+      </w:pPr>
+      <w:r>
+        <w:rPr>
+          <w:rFonts w:ascii="Calibri" w:eastAsia="Times New Roman" w:hAnsi="Calibri"/>
+          <w:caps/>
+          <w:color w:val="102A43"/>
+          <w:spacing w:val="19"/>
+          <w:sz w:val="21"/>
+          <w:szCs w:val="21"/>
+          <w:lang w:val="de-DE"/>
+        </w:rPr>
+        <w:t>Sprachen</w:t>
+      </w:r>
+    </w:p>
+    <w:p>
+      <w:pPr>
+        <w:divId w:val="437798251"/>
         <w:rPr>
           <w:rFonts w:ascii="Calibri" w:eastAsia="Times New Roman" w:hAnsi="Calibri"/>
           <w:color w:val="1D3248"/>
@@ -1908,7 +2376,7 @@
           <w:szCs w:val="17"/>
           <w:lang w:val="de-DE"/>
         </w:rPr>
-        <w:t>IREB CPRE Foundation Level</w:t>
+        <w:t>Deutsch</w:t>
       </w:r>
       <w:r>
         <w:rPr>
@@ -1918,44 +2386,12 @@
           <w:szCs w:val="15"/>
           <w:lang w:val="de-DE"/>
         </w:rPr>
-        <w:t>Offiziell bestandene Zertifikatsprüfung · SAQ/IREB</w:t>
-      </w:r>
-    </w:p>
-    <w:p>
-      <w:pPr>
-        <w:divId w:val="1952008955"/>
-        <w:rPr>
-          <w:rFonts w:ascii="Calibri" w:eastAsia="Times New Roman" w:hAnsi="Calibri"/>
-          <w:color w:val="1D3248"/>
-          <w:sz w:val="18"/>
-          <w:szCs w:val="18"/>
-          <w:lang w:val="de-DE"/>
-        </w:rPr>
-      </w:pPr>
-      <w:r>
-        <w:rPr>
-          <w:rFonts w:ascii="Calibri" w:eastAsia="Times New Roman" w:hAnsi="Calibri"/>
-          <w:color w:val="1D3248"/>
-          <w:sz w:val="18"/>
-          <w:szCs w:val="18"/>
-          <w:lang w:val="de-DE"/>
-        </w:rPr>
-        <w:t>06/202</w:t>
-      </w:r>
-      <w:r>
-        <w:rPr>
-          <w:rFonts w:ascii="Calibri" w:eastAsia="Times New Roman" w:hAnsi="Calibri"/>
-          <w:color w:val="1D3248"/>
-          <w:sz w:val="18"/>
-          <w:szCs w:val="18"/>
-          <w:lang w:val="de-DE"/>
-        </w:rPr>
-        <w:t>6</w:t>
-      </w:r>
-    </w:p>
-    <w:p>
-      <w:pPr>
-        <w:divId w:val="438839238"/>
+        <w:t>Muttersprache</w:t>
+      </w:r>
+    </w:p>
+    <w:p>
+      <w:pPr>
+        <w:divId w:val="1300038121"/>
         <w:rPr>
           <w:rFonts w:ascii="Calibri" w:eastAsia="Times New Roman" w:hAnsi="Calibri"/>
           <w:color w:val="1D3248"/>
@@ -1974,7 +2410,7 @@
           <w:szCs w:val="17"/>
           <w:lang w:val="de-DE"/>
         </w:rPr>
-        <w:t>SAFe 6 Agilist</w:t>
+        <w:t>Englisch</w:t>
       </w:r>
       <w:r>
         <w:rPr>
@@ -1984,351 +2420,12 @@
           <w:szCs w:val="15"/>
           <w:lang w:val="de-DE"/>
         </w:rPr>
-        <w:t>Scaled Agile · gültig bis 11/2026</w:t>
-      </w:r>
-    </w:p>
-    <w:p>
-      <w:pPr>
-        <w:divId w:val="1825001040"/>
-        <w:rPr>
-          <w:rFonts w:ascii="Calibri" w:eastAsia="Times New Roman" w:hAnsi="Calibri"/>
-          <w:color w:val="1D3248"/>
-          <w:sz w:val="18"/>
-          <w:szCs w:val="18"/>
-          <w:lang w:val="de-DE"/>
-        </w:rPr>
-      </w:pPr>
-      <w:r>
-        <w:rPr>
-          <w:rFonts w:ascii="Calibri" w:eastAsia="Times New Roman" w:hAnsi="Calibri"/>
-          <w:color w:val="1D3248"/>
-          <w:sz w:val="18"/>
-          <w:szCs w:val="18"/>
-          <w:lang w:val="de-DE"/>
-        </w:rPr>
-        <w:t>202</w:t>
-      </w:r>
-      <w:r>
-        <w:rPr>
-          <w:rFonts w:ascii="Calibri" w:eastAsia="Times New Roman" w:hAnsi="Calibri"/>
-          <w:color w:val="1D3248"/>
-          <w:sz w:val="18"/>
-          <w:szCs w:val="18"/>
-          <w:lang w:val="de-DE"/>
-        </w:rPr>
-        <w:t>5</w:t>
-      </w:r>
-    </w:p>
-    <w:p>
-      <w:pPr>
-        <w:divId w:val="1670600819"/>
-        <w:rPr>
-          <w:rFonts w:ascii="Calibri" w:eastAsia="Times New Roman" w:hAnsi="Calibri"/>
-          <w:color w:val="1D3248"/>
-          <w:sz w:val="18"/>
-          <w:szCs w:val="18"/>
-          <w:lang w:val="de-DE"/>
-        </w:rPr>
-      </w:pPr>
-      <w:r>
-        <w:rPr>
-          <w:rFonts w:ascii="Calibri" w:eastAsia="Times New Roman" w:hAnsi="Calibri"/>
-          <w:b/>
-          <w:bCs/>
-          <w:color w:val="20364D"/>
-          <w:sz w:val="17"/>
-          <w:szCs w:val="17"/>
-          <w:lang w:val="de-DE"/>
-        </w:rPr>
-        <w:t>Professional Scrum Master I</w:t>
-      </w:r>
-      <w:r>
-        <w:rPr>
-          <w:rFonts w:ascii="Calibri" w:eastAsia="Times New Roman" w:hAnsi="Calibri"/>
-          <w:color w:val="65788C"/>
-          <w:sz w:val="15"/>
-          <w:szCs w:val="15"/>
-          <w:lang w:val="de-DE"/>
-        </w:rPr>
-        <w:t>Scrum.org · PSM I</w:t>
-      </w:r>
-    </w:p>
-    <w:p>
-      <w:pPr>
-        <w:divId w:val="1331450973"/>
-        <w:rPr>
-          <w:rFonts w:ascii="Calibri" w:eastAsia="Times New Roman" w:hAnsi="Calibri"/>
-          <w:color w:val="1D3248"/>
-          <w:sz w:val="18"/>
-          <w:szCs w:val="18"/>
-          <w:lang w:val="de-DE"/>
-        </w:rPr>
-      </w:pPr>
-      <w:r>
-        <w:rPr>
-          <w:rFonts w:ascii="Calibri" w:eastAsia="Times New Roman" w:hAnsi="Calibri"/>
-          <w:color w:val="1D3248"/>
-          <w:sz w:val="18"/>
-          <w:szCs w:val="18"/>
-          <w:lang w:val="de-DE"/>
-        </w:rPr>
-        <w:t>09/202</w:t>
-      </w:r>
-      <w:r>
-        <w:rPr>
-          <w:rFonts w:ascii="Calibri" w:eastAsia="Times New Roman" w:hAnsi="Calibri"/>
-          <w:color w:val="1D3248"/>
-          <w:sz w:val="18"/>
-          <w:szCs w:val="18"/>
-          <w:lang w:val="de-DE"/>
-        </w:rPr>
-        <w:t>4</w:t>
-      </w:r>
-    </w:p>
-    <w:p>
-      <w:pPr>
-        <w:divId w:val="498546438"/>
-        <w:rPr>
-          <w:rFonts w:ascii="Calibri" w:eastAsia="Times New Roman" w:hAnsi="Calibri"/>
-          <w:color w:val="1D3248"/>
-          <w:sz w:val="18"/>
-          <w:szCs w:val="18"/>
-          <w:lang w:val="de-DE"/>
-        </w:rPr>
-      </w:pPr>
-      <w:r>
-        <w:rPr>
-          <w:rFonts w:ascii="Calibri" w:eastAsia="Times New Roman" w:hAnsi="Calibri"/>
-          <w:b/>
-          <w:bCs/>
-          <w:color w:val="20364D"/>
-          <w:sz w:val="17"/>
-          <w:szCs w:val="17"/>
-          <w:lang w:val="de-DE"/>
-        </w:rPr>
-        <w:t>Cambridge English A2</w:t>
-      </w:r>
-      <w:r>
-        <w:rPr>
-          <w:rFonts w:ascii="Calibri" w:eastAsia="Times New Roman" w:hAnsi="Calibri"/>
-          <w:color w:val="65788C"/>
-          <w:sz w:val="15"/>
-          <w:szCs w:val="15"/>
-          <w:lang w:val="de-DE"/>
-        </w:rPr>
-        <w:t>Gesamtergebnis 136</w:t>
-      </w:r>
-    </w:p>
-    <w:p>
-      <w:pPr>
-        <w:divId w:val="1804226491"/>
-        <w:rPr>
-          <w:rFonts w:ascii="Calibri" w:eastAsia="Times New Roman" w:hAnsi="Calibri"/>
-          <w:color w:val="1D3248"/>
-          <w:sz w:val="18"/>
-          <w:szCs w:val="18"/>
-          <w:lang w:val="de-DE"/>
-        </w:rPr>
-      </w:pPr>
-      <w:r>
-        <w:rPr>
-          <w:rFonts w:ascii="Calibri" w:eastAsia="Times New Roman" w:hAnsi="Calibri"/>
-          <w:color w:val="1D3248"/>
-          <w:sz w:val="18"/>
-          <w:szCs w:val="18"/>
-          <w:lang w:val="de-DE"/>
-        </w:rPr>
-        <w:t>202</w:t>
-      </w:r>
-      <w:r>
-        <w:rPr>
-          <w:rFonts w:ascii="Calibri" w:eastAsia="Times New Roman" w:hAnsi="Calibri"/>
-          <w:color w:val="1D3248"/>
-          <w:sz w:val="18"/>
-          <w:szCs w:val="18"/>
-          <w:lang w:val="de-DE"/>
-        </w:rPr>
-        <w:t>5</w:t>
-      </w:r>
-    </w:p>
-    <w:p>
-      <w:pPr>
-        <w:pStyle w:val="berschrift2"/>
-        <w:spacing w:before="0" w:beforeAutospacing="0" w:after="170" w:afterAutospacing="0"/>
-        <w:divId w:val="954412652"/>
-        <w:rPr>
-          <w:rFonts w:ascii="Calibri" w:eastAsia="Times New Roman" w:hAnsi="Calibri"/>
-          <w:caps/>
-          <w:color w:val="102A43"/>
-          <w:spacing w:val="19"/>
-          <w:sz w:val="21"/>
-          <w:szCs w:val="21"/>
-          <w:lang w:val="de-DE"/>
-        </w:rPr>
-      </w:pPr>
-      <w:r>
-        <w:rPr>
-          <w:rFonts w:ascii="Calibri" w:eastAsia="Times New Roman" w:hAnsi="Calibri"/>
-          <w:caps/>
-          <w:color w:val="102A43"/>
-          <w:spacing w:val="19"/>
-          <w:sz w:val="21"/>
-          <w:szCs w:val="21"/>
-          <w:lang w:val="de-DE"/>
-        </w:rPr>
-        <w:t>Methoden &amp; Werkzeuge</w:t>
-      </w:r>
-    </w:p>
-    <w:p>
-      <w:pPr>
-        <w:divId w:val="1255556447"/>
-        <w:rPr>
-          <w:rFonts w:ascii="Calibri" w:eastAsia="Times New Roman" w:hAnsi="Calibri"/>
-          <w:color w:val="1D3248"/>
-          <w:sz w:val="18"/>
-          <w:szCs w:val="18"/>
-          <w:lang w:val="de-DE"/>
-        </w:rPr>
-      </w:pPr>
-      <w:r>
-        <w:rPr>
-          <w:rFonts w:ascii="Calibri" w:eastAsia="Times New Roman" w:hAnsi="Calibri"/>
-          <w:color w:val="405970"/>
-          <w:sz w:val="15"/>
-          <w:szCs w:val="15"/>
-          <w:bdr w:val="single" w:sz="6" w:space="4" w:color="D7E1EC" w:frame="1"/>
-          <w:lang w:val="de-DE"/>
-        </w:rPr>
-        <w:t>IREBBPMNScrumSAFeUser StoriesUse CasesAkzeptanzkriterienTestdesignJira*Confluence*Trello*SQLPostgreSQLNext.js/ReactSupabaseMicrosoft 365Adobe CC</w:t>
-      </w:r>
-      <w:r>
-        <w:rPr>
-          <w:rFonts w:ascii="Calibri" w:eastAsia="Times New Roman" w:hAnsi="Calibri"/>
-          <w:color w:val="1D3248"/>
-          <w:sz w:val="18"/>
-          <w:szCs w:val="18"/>
-          <w:lang w:val="de-DE"/>
-        </w:rPr>
-        <w:t xml:space="preserve"> </w:t>
-      </w:r>
-    </w:p>
-    <w:p>
-      <w:pPr>
-        <w:pStyle w:val="small-note"/>
-        <w:spacing w:after="100" w:afterAutospacing="1"/>
-        <w:divId w:val="954412652"/>
-        <w:rPr>
-          <w:rFonts w:ascii="Calibri" w:hAnsi="Calibri"/>
-          <w:lang w:val="de-DE"/>
-        </w:rPr>
-      </w:pPr>
-      <w:r>
-        <w:rPr>
-          <w:rFonts w:ascii="Calibri" w:hAnsi="Calibri"/>
-          <w:lang w:val="de-DE"/>
-        </w:rPr>
-        <w:t>* Anwendung im Studium und in Projektarbeiten; nicht als Werkzeugnachweis für das X-ITE-Projekt ausgewiesen.</w:t>
-      </w:r>
-    </w:p>
-    <w:p>
-      <w:pPr>
-        <w:pStyle w:val="berschrift2"/>
-        <w:spacing w:before="0" w:beforeAutospacing="0" w:after="170" w:afterAutospacing="0"/>
-        <w:divId w:val="954412652"/>
-        <w:rPr>
-          <w:rFonts w:ascii="Calibri" w:eastAsia="Times New Roman" w:hAnsi="Calibri"/>
-          <w:caps/>
-          <w:color w:val="102A43"/>
-          <w:spacing w:val="19"/>
-          <w:sz w:val="21"/>
-          <w:szCs w:val="21"/>
-          <w:lang w:val="de-DE"/>
-        </w:rPr>
-      </w:pPr>
-      <w:r>
-        <w:rPr>
-          <w:rFonts w:ascii="Calibri" w:eastAsia="Times New Roman" w:hAnsi="Calibri"/>
-          <w:caps/>
-          <w:color w:val="102A43"/>
-          <w:spacing w:val="19"/>
-          <w:sz w:val="21"/>
-          <w:szCs w:val="21"/>
-          <w:lang w:val="de-DE"/>
-        </w:rPr>
-        <w:t>Sprachen</w:t>
-      </w:r>
-    </w:p>
-    <w:p>
-      <w:pPr>
-        <w:divId w:val="1714575026"/>
-        <w:rPr>
-          <w:rFonts w:ascii="Calibri" w:eastAsia="Times New Roman" w:hAnsi="Calibri"/>
-          <w:color w:val="1D3248"/>
-          <w:sz w:val="18"/>
-          <w:szCs w:val="18"/>
-          <w:lang w:val="de-DE"/>
-        </w:rPr>
-      </w:pPr>
-      <w:r>
-        <w:rPr>
-          <w:rFonts w:ascii="Calibri" w:eastAsia="Times New Roman" w:hAnsi="Calibri"/>
-          <w:b/>
-          <w:bCs/>
-          <w:color w:val="20364D"/>
-          <w:sz w:val="17"/>
-          <w:szCs w:val="17"/>
-          <w:lang w:val="de-DE"/>
-        </w:rPr>
-        <w:t>Deutsch</w:t>
-      </w:r>
-      <w:r>
-        <w:rPr>
-          <w:rFonts w:ascii="Calibri" w:eastAsia="Times New Roman" w:hAnsi="Calibri"/>
-          <w:color w:val="65788C"/>
-          <w:sz w:val="15"/>
-          <w:szCs w:val="15"/>
-          <w:lang w:val="de-DE"/>
-        </w:rPr>
-        <w:t>Muttersprache</w:t>
-      </w:r>
-    </w:p>
-    <w:p>
-      <w:pPr>
-        <w:divId w:val="134566813"/>
-        <w:rPr>
-          <w:rFonts w:ascii="Calibri" w:eastAsia="Times New Roman" w:hAnsi="Calibri"/>
-          <w:color w:val="1D3248"/>
-          <w:sz w:val="18"/>
-          <w:szCs w:val="18"/>
-          <w:lang w:val="de-DE"/>
-        </w:rPr>
-      </w:pPr>
-      <w:r>
-        <w:rPr>
-          <w:rFonts w:ascii="Calibri" w:eastAsia="Times New Roman" w:hAnsi="Calibri"/>
-          <w:b/>
-          <w:bCs/>
-          <w:color w:val="20364D"/>
-          <w:sz w:val="17"/>
-          <w:szCs w:val="17"/>
-          <w:lang w:val="de-DE"/>
-        </w:rPr>
-        <w:t>Englisch</w:t>
-      </w:r>
-      <w:r>
-        <w:rPr>
-          <w:rFonts w:ascii="Calibri" w:eastAsia="Times New Roman" w:hAnsi="Calibri"/>
-          <w:color w:val="65788C"/>
-          <w:sz w:val="15"/>
-          <w:szCs w:val="15"/>
-          <w:lang w:val="de-DE"/>
-        </w:rPr>
         <w:t>A2 zertifiziert; laufende Weiterentwicklung</w:t>
       </w:r>
     </w:p>
     <w:p>
       <w:pPr>
-        <w:divId w:val="234828183"/>
+        <w:divId w:val="911278123"/>
         <w:rPr>
           <w:rFonts w:ascii="Calibri" w:eastAsia="Times New Roman" w:hAnsi="Calibri"/>
           <w:color w:val="7B8DA0"/>
@@ -2465,9 +2562,9 @@
 <file path=word/numbering.xml><?xml version="1.0" encoding="utf-8"?>
 <w:numbering xmlns:wpc="http://schemas.microsoft.com/office/word/2010/wordprocessingCanvas" xmlns:cx="http://schemas.microsoft.com/office/drawing/2014/chartex" xmlns:cx1="http://schemas.microsoft.com/office/drawing/2015/9/8/chartex" xmlns:cx2="http://schemas.microsoft.com/office/drawing/2015/10/21/chartex" xmlns:cx3="http://schemas.microsoft.com/office/drawing/2016/5/9/chartex" xmlns:cx4="http://schemas.microsoft.com/office/drawing/2016/5/10/chartex" xmlns:cx5="http://schemas.microsoft.com/office/drawing/2016/5/11/chartex" xmlns:cx6="http://schemas.microsoft.com/office/drawing/2016/5/12/chartex" xmlns:cx7="http://schemas.microsoft.com/office/drawing/2016/5/13/chartex" xmlns:cx8="http://schemas.microsoft.com/office/drawing/2016/5/14/chartex" xmlns:mc="http://schemas.openxmlformats.org/markup-compatibility/2006" xmlns:m="http://schemas.openxmlformats.org/officeDocument/2006/math" xmlns:aink="http://schemas.microsoft.com/office/drawing/2016/ink" xmlns:am3d="http://schemas.microsoft.com/office/drawing/2017/model3d" xmlns:oel="http://schemas.microsoft.com/office/2019/extlst" xmlns:r="http://schemas.openxmlformats.org/officeDocument/2006/relationships" xmlns:wp14="http://schemas.microsoft.com/office/word/2010/wordprocessingDrawing" xmlns:wp="http://schemas.openxmlformats.org/drawingml/2006/wordprocessingDrawing" xmlns:wpg="http://schemas.microsoft.com/office/word/2010/wordprocessingGroup" xmlns:wpi="http://schemas.microsoft.com/office/word/2010/wordprocessingInk" xmlns:wps="http://schemas.microsoft.com/office/word/2010/wordprocessingShape" xmlns:o="urn:schemas-microsoft-com:office:office" xmlns:v="urn:schemas-microsoft-com:vml" xmlns:w10="urn:schemas-microsoft-com:office:word" xmlns:w="http://schemas.openxmlformats.org/wordprocessingml/2006/main" xmlns:w14="http://schemas.microsoft.com/office/word/2010/wordml" xmlns:w15="http://schemas.microsoft.com/office/word/2012/wordml" xmlns:w16cei="http://schemas.microsoft.com/office/word/2026/wordml/cei" xmlns:w16cex="http://schemas.microsoft.com/office/word/2018/wordml/cex" xmlns:w16cid="http://schemas.microsoft.com/office/word/2016/wordml/cid" xmlns:w16="http://schemas.microsoft.com/office/word/2018/wordml" xmlns:w16sdtdh="http://schemas.microsoft.com/office/word/2020/wordml/sdtdatahash" xmlns:w16sdtfl="http://schemas.microsoft.com/office/word/2024/wordml/sdtformatlock" xmlns:w16se="http://schemas.microsoft.com/office/word/2015/wordml/symex" xmlns:w16du="http://schemas.microsoft.com/office/word/2023/wordml/word16du" xmlns:wne="http://schemas.microsoft.com/office/word/2006/wordml" mc:Ignorable="w14 w15 w16se w16cid w16 w16cex w16sdtdh w16sdtfl w16du wp14">
   <w:abstractNum w:abstractNumId="0" w15:restartNumberingAfterBreak="0">
-    <w:nsid w:val="535660BA"/>
+    <w:nsid w:val="0568182A"/>
     <w:multiLevelType w:val="multilevel"/>
-    <w:tmpl w:val="0D805F7A"/>
+    <w:tmpl w:val="87381256"/>
     <w:lvl w:ilvl="0">
       <w:start w:val="1"/>
       <w:numFmt w:val="bullet"/>
@@ -2614,9 +2711,9 @@
     </w:lvl>
   </w:abstractNum>
   <w:abstractNum w:abstractNumId="1" w15:restartNumberingAfterBreak="0">
-    <w:nsid w:val="61E60934"/>
+    <w:nsid w:val="32D00370"/>
     <w:multiLevelType w:val="multilevel"/>
-    <w:tmpl w:val="9EF6D310"/>
+    <w:tmpl w:val="0E58B438"/>
     <w:lvl w:ilvl="0">
       <w:start w:val="1"/>
       <w:numFmt w:val="bullet"/>
@@ -2762,11 +2859,163 @@
       </w:rPr>
     </w:lvl>
   </w:abstractNum>
-  <w:num w:numId="1" w16cid:durableId="293096924">
+  <w:abstractNum w:abstractNumId="2" w15:restartNumberingAfterBreak="0">
+    <w:nsid w:val="33D249BD"/>
+    <w:multiLevelType w:val="multilevel"/>
+    <w:tmpl w:val="3CD88A4E"/>
+    <w:lvl w:ilvl="0">
+      <w:start w:val="1"/>
+      <w:numFmt w:val="bullet"/>
+      <w:lvlText w:val=""/>
+      <w:lvlJc w:val="left"/>
+      <w:pPr>
+        <w:tabs>
+          <w:tab w:val="num" w:pos="720"/>
+        </w:tabs>
+        <w:ind w:left="720" w:hanging="360"/>
+      </w:pPr>
+      <w:rPr>
+        <w:rFonts w:ascii="Symbol" w:hAnsi="Symbol" w:hint="default"/>
+        <w:sz w:val="20"/>
+      </w:rPr>
+    </w:lvl>
+    <w:lvl w:ilvl="1" w:tentative="1">
+      <w:start w:val="1"/>
+      <w:numFmt w:val="bullet"/>
+      <w:lvlText w:val="o"/>
+      <w:lvlJc w:val="left"/>
+      <w:pPr>
+        <w:tabs>
+          <w:tab w:val="num" w:pos="1440"/>
+        </w:tabs>
+        <w:ind w:left="1440" w:hanging="360"/>
+      </w:pPr>
+      <w:rPr>
+        <w:rFonts w:ascii="Courier New" w:hAnsi="Courier New" w:hint="default"/>
+        <w:sz w:val="20"/>
+      </w:rPr>
+    </w:lvl>
+    <w:lvl w:ilvl="2" w:tentative="1">
+      <w:start w:val="1"/>
+      <w:numFmt w:val="bullet"/>
+      <w:lvlText w:val=""/>
+      <w:lvlJc w:val="left"/>
+      <w:pPr>
+        <w:tabs>
+          <w:tab w:val="num" w:pos="2160"/>
+        </w:tabs>
+        <w:ind w:left="2160" w:hanging="360"/>
+      </w:pPr>
+      <w:rPr>
+        <w:rFonts w:ascii="Wingdings" w:hAnsi="Wingdings" w:hint="default"/>
+        <w:sz w:val="20"/>
+      </w:rPr>
+    </w:lvl>
+    <w:lvl w:ilvl="3" w:tentative="1">
+      <w:start w:val="1"/>
+      <w:numFmt w:val="bullet"/>
+      <w:lvlText w:val=""/>
+      <w:lvlJc w:val="left"/>
+      <w:pPr>
+        <w:tabs>
+          <w:tab w:val="num" w:pos="2880"/>
+        </w:tabs>
+        <w:ind w:left="2880" w:hanging="360"/>
+      </w:pPr>
+      <w:rPr>
+        <w:rFonts w:ascii="Wingdings" w:hAnsi="Wingdings" w:hint="default"/>
+        <w:sz w:val="20"/>
+      </w:rPr>
+    </w:lvl>
+    <w:lvl w:ilvl="4" w:tentative="1">
+      <w:start w:val="1"/>
+      <w:numFmt w:val="bullet"/>
+      <w:lvlText w:val=""/>
+      <w:lvlJc w:val="left"/>
+      <w:pPr>
+        <w:tabs>
+          <w:tab w:val="num" w:pos="3600"/>
+        </w:tabs>
+        <w:ind w:left="3600" w:hanging="360"/>
+      </w:pPr>
+      <w:rPr>
+        <w:rFonts w:ascii="Wingdings" w:hAnsi="Wingdings" w:hint="default"/>
+        <w:sz w:val="20"/>
+      </w:rPr>
+    </w:lvl>
+    <w:lvl w:ilvl="5" w:tentative="1">
+      <w:start w:val="1"/>
+      <w:numFmt w:val="bullet"/>
+      <w:lvlText w:val=""/>
+      <w:lvlJc w:val="left"/>
+      <w:pPr>
+        <w:tabs>
+          <w:tab w:val="num" w:pos="4320"/>
+        </w:tabs>
+        <w:ind w:left="4320" w:hanging="360"/>
+      </w:pPr>
+      <w:rPr>
+        <w:rFonts w:ascii="Wingdings" w:hAnsi="Wingdings" w:hint="default"/>
+        <w:sz w:val="20"/>
+      </w:rPr>
+    </w:lvl>
+    <w:lvl w:ilvl="6" w:tentative="1">
+      <w:start w:val="1"/>
+      <w:numFmt w:val="bullet"/>
+      <w:lvlText w:val=""/>
+      <w:lvlJc w:val="left"/>
+      <w:pPr>
+        <w:tabs>
+          <w:tab w:val="num" w:pos="5040"/>
+        </w:tabs>
+        <w:ind w:left="5040" w:hanging="360"/>
+      </w:pPr>
+      <w:rPr>
+        <w:rFonts w:ascii="Wingdings" w:hAnsi="Wingdings" w:hint="default"/>
+        <w:sz w:val="20"/>
+      </w:rPr>
+    </w:lvl>
+    <w:lvl w:ilvl="7" w:tentative="1">
+      <w:start w:val="1"/>
+      <w:numFmt w:val="bullet"/>
+      <w:lvlText w:val=""/>
+      <w:lvlJc w:val="left"/>
+      <w:pPr>
+        <w:tabs>
+          <w:tab w:val="num" w:pos="5760"/>
+        </w:tabs>
+        <w:ind w:left="5760" w:hanging="360"/>
+      </w:pPr>
+      <w:rPr>
+        <w:rFonts w:ascii="Wingdings" w:hAnsi="Wingdings" w:hint="default"/>
+        <w:sz w:val="20"/>
+      </w:rPr>
+    </w:lvl>
+    <w:lvl w:ilvl="8" w:tentative="1">
+      <w:start w:val="1"/>
+      <w:numFmt w:val="bullet"/>
+      <w:lvlText w:val=""/>
+      <w:lvlJc w:val="left"/>
+      <w:pPr>
+        <w:tabs>
+          <w:tab w:val="num" w:pos="6480"/>
+        </w:tabs>
+        <w:ind w:left="6480" w:hanging="360"/>
+      </w:pPr>
+      <w:rPr>
+        <w:rFonts w:ascii="Wingdings" w:hAnsi="Wingdings" w:hint="default"/>
+        <w:sz w:val="20"/>
+      </w:rPr>
+    </w:lvl>
+  </w:abstractNum>
+  <w:num w:numId="1" w16cid:durableId="876115603">
+    <w:abstractNumId w:val="1"/>
+  </w:num>
+  <w:num w:numId="2" w16cid:durableId="1536887412">
     <w:abstractNumId w:val="0"/>
   </w:num>
-  <w:num w:numId="2" w16cid:durableId="1373504795">
-    <w:abstractNumId w:val="1"/>
+  <w:num w:numId="3" w16cid:durableId="737745687">
+    <w:abstractNumId w:val="2"/>
   </w:num>
 </w:numbering>
 </file>
@@ -3766,7 +4015,7 @@
     <w:link w:val="KopfzeileZchn"/>
     <w:uiPriority w:val="99"/>
     <w:unhideWhenUsed/>
-    <w:rsid w:val="00394D7F"/>
+    <w:rsid w:val="0041460F"/>
     <w:pPr>
       <w:tabs>
         <w:tab w:val="center" w:pos="4536"/>
@@ -3779,7 +4028,7 @@
     <w:basedOn w:val="Absatz-Standardschriftart"/>
     <w:link w:val="Kopfzeile"/>
     <w:uiPriority w:val="99"/>
-    <w:rsid w:val="00394D7F"/>
+    <w:rsid w:val="0041460F"/>
     <w:rPr>
       <w:rFonts w:eastAsiaTheme="minorEastAsia"/>
       <w:sz w:val="24"/>
@@ -3792,7 +4041,7 @@
     <w:link w:val="FuzeileZchn"/>
     <w:uiPriority w:val="99"/>
     <w:unhideWhenUsed/>
-    <w:rsid w:val="00394D7F"/>
+    <w:rsid w:val="0041460F"/>
     <w:pPr>
       <w:tabs>
         <w:tab w:val="center" w:pos="4536"/>
@@ -3805,7 +4054,7 @@
     <w:basedOn w:val="Absatz-Standardschriftart"/>
     <w:link w:val="Fuzeile"/>
     <w:uiPriority w:val="99"/>
-    <w:rsid w:val="00394D7F"/>
+    <w:rsid w:val="0041460F"/>
     <w:rPr>
       <w:rFonts w:eastAsiaTheme="minorEastAsia"/>
       <w:sz w:val="24"/>

</xml_diff>